<commit_message>
fix: avoid overlapping text from image-mark crops
Skip cropped image marks that overlap editable text, record the background-loss trade-off, and update the validated German output alongside repository cleanup.
</commit_message>
<xml_diff>
--- a/outputs/DEU_child_checkup.docx
+++ b/outputs/DEU_child_checkup.docx
@@ -7,48 +7,7 @@
         <w:spacing w:before="0" w:after="0" w:line="20" w:lineRule="exact"/>
       </w:pPr>
       <w:bookmarkStart w:id="1" w:name="p0001_r0001"/>
-      <w:r>
-        <w:drawing>
-          <wp:anchor xmlns:a="http://schemas.openxmlformats.org/drawingml/2006/main" xmlns:pic="http://schemas.openxmlformats.org/drawingml/2006/picture" distT="0" distB="0" distL="0" distR="0" simplePos="0" relativeHeight="1" behindDoc="0" locked="0" layoutInCell="1" allowOverlap="1">
-            <wp:simplePos x="0" y="0"/>
-            <wp:positionH relativeFrom="page">
-              <wp:posOffset>2755392</wp:posOffset>
-            </wp:positionH>
-            <wp:positionV relativeFrom="page">
-              <wp:posOffset>0</wp:posOffset>
-            </wp:positionV>
-            <wp:extent cx="2028846" cy="425078"/>
-            <wp:wrapNone/>
-            <wp:docPr id="1" name="Picture 1"/>
-            <wp:cNvGraphicFramePr>
-              <a:graphicFrameLocks noChangeAspect="1"/>
-            </wp:cNvGraphicFramePr>
-            <a:graphic>
-              <a:graphicData uri="http://schemas.openxmlformats.org/drawingml/2006/picture">
-                <pic:pic>
-                  <pic:nvPicPr>
-                    <pic:cNvPr id="0" name="image.png"/>
-                    <pic:cNvPicPr/>
-                  </pic:nvPicPr>
-                  <pic:blipFill>
-                    <a:blip r:embed="rId9"/>
-                    <a:stretch>
-                      <a:fillRect/>
-                    </a:stretch>
-                  </pic:blipFill>
-                  <pic:spPr>
-                    <a:xfrm>
-                      <a:off x="0" y="0"/>
-                      <a:ext cx="2028846" cy="425078"/>
-                    </a:xfrm>
-                    <a:prstGeom prst="rect"/>
-                  </pic:spPr>
-                </pic:pic>
-              </a:graphicData>
-            </a:graphic>
-          </wp:anchor>
-        </w:drawing>
-      </w:r>
+      <w:r/>
       <w:bookmarkEnd w:id="1"/>
       <w:bookmarkStart w:id="2" w:name="p0001_r0002"/>
       <w:r>
@@ -56,12 +15,12 @@
           <wp:anchor distT="0" distB="0" distL="0" distR="0" simplePos="0" relativeHeight="2" behindDoc="0" locked="0" layoutInCell="1" allowOverlap="1">
             <wp:simplePos x="0" y="0"/>
             <wp:positionH relativeFrom="page">
-              <wp:posOffset>2865060</wp:posOffset>
+              <wp:posOffset>2869629</wp:posOffset>
             </wp:positionH>
             <wp:positionV relativeFrom="page">
               <wp:posOffset>205683</wp:posOffset>
             </wp:positionV>
-            <wp:extent cx="1119521" cy="137122"/>
+            <wp:extent cx="1114951" cy="132551"/>
             <wp:effectExtent l="0" t="0" r="0" b="0"/>
             <wp:wrapNone/>
             <wp:docPr id="2" name="Region 2"/>
@@ -106,12 +65,12 @@
           <wp:anchor distT="0" distB="0" distL="0" distR="0" simplePos="0" relativeHeight="3" behindDoc="0" locked="0" layoutInCell="1" allowOverlap="1">
             <wp:simplePos x="0" y="0"/>
             <wp:positionH relativeFrom="page">
-              <wp:posOffset>4377555</wp:posOffset>
+              <wp:posOffset>4382125</wp:posOffset>
             </wp:positionH>
             <wp:positionV relativeFrom="page">
-              <wp:posOffset>114269</wp:posOffset>
+              <wp:posOffset>123410</wp:posOffset>
             </wp:positionV>
-            <wp:extent cx="306155" cy="205683"/>
+            <wp:extent cx="297016" cy="191971"/>
             <wp:effectExtent l="0" t="0" r="0" b="0"/>
             <wp:wrapNone/>
             <wp:docPr id="3" name="Region 3"/>
@@ -159,9 +118,9 @@
               <wp:posOffset>534628</wp:posOffset>
             </wp:positionH>
             <wp:positionV relativeFrom="page">
-              <wp:posOffset>822733</wp:posOffset>
+              <wp:posOffset>809021</wp:posOffset>
             </wp:positionV>
-            <wp:extent cx="1082965" cy="219396"/>
+            <wp:extent cx="1064687" cy="237679"/>
             <wp:effectExtent l="0" t="0" r="0" b="0"/>
             <wp:wrapNone/>
             <wp:docPr id="4" name="Region 4"/>
@@ -211,7 +170,7 @@
             <wp:positionV relativeFrom="page">
               <wp:posOffset>804450</wp:posOffset>
             </wp:positionV>
-            <wp:extent cx="237612" cy="242249"/>
+            <wp:extent cx="242182" cy="242249"/>
             <wp:wrapNone/>
             <wp:docPr id="5" name="Picture 5"/>
             <wp:cNvGraphicFramePr>
@@ -225,7 +184,7 @@
                     <pic:cNvPicPr/>
                   </pic:nvPicPr>
                   <pic:blipFill>
-                    <a:blip r:embed="rId10"/>
+                    <a:blip r:embed="rId9"/>
                     <a:stretch>
                       <a:fillRect/>
                     </a:stretch>
@@ -233,7 +192,7 @@
                   <pic:spPr>
                     <a:xfrm>
                       <a:off x="0" y="0"/>
-                      <a:ext cx="237612" cy="242249"/>
+                      <a:ext cx="242182" cy="242249"/>
                     </a:xfrm>
                     <a:prstGeom prst="rect"/>
                   </pic:spPr>
@@ -245,48 +204,7 @@
       </w:r>
       <w:bookmarkEnd w:id="5"/>
       <w:bookmarkStart w:id="6" w:name="p0001_r0006"/>
-      <w:r>
-        <w:drawing>
-          <wp:anchor xmlns:a="http://schemas.openxmlformats.org/drawingml/2006/main" xmlns:pic="http://schemas.openxmlformats.org/drawingml/2006/picture" distT="0" distB="0" distL="0" distR="0" simplePos="0" relativeHeight="6" behindDoc="0" locked="0" layoutInCell="1" allowOverlap="1">
-            <wp:simplePos x="0" y="0"/>
-            <wp:positionH relativeFrom="page">
-              <wp:posOffset>2947310</wp:posOffset>
-            </wp:positionH>
-            <wp:positionV relativeFrom="page">
-              <wp:posOffset>827304</wp:posOffset>
-            </wp:positionV>
-            <wp:extent cx="1836928" cy="196541"/>
-            <wp:wrapNone/>
-            <wp:docPr id="6" name="Picture 6"/>
-            <wp:cNvGraphicFramePr>
-              <a:graphicFrameLocks noChangeAspect="1"/>
-            </wp:cNvGraphicFramePr>
-            <a:graphic>
-              <a:graphicData uri="http://schemas.openxmlformats.org/drawingml/2006/picture">
-                <pic:pic>
-                  <pic:nvPicPr>
-                    <pic:cNvPr id="0" name="image.png"/>
-                    <pic:cNvPicPr/>
-                  </pic:nvPicPr>
-                  <pic:blipFill>
-                    <a:blip r:embed="rId11"/>
-                    <a:stretch>
-                      <a:fillRect/>
-                    </a:stretch>
-                  </pic:blipFill>
-                  <pic:spPr>
-                    <a:xfrm>
-                      <a:off x="0" y="0"/>
-                      <a:ext cx="1836928" cy="196541"/>
-                    </a:xfrm>
-                    <a:prstGeom prst="rect"/>
-                  </pic:spPr>
-                </pic:pic>
-              </a:graphicData>
-            </a:graphic>
-          </wp:anchor>
-        </w:drawing>
-      </w:r>
+      <w:r/>
       <w:bookmarkEnd w:id="6"/>
       <w:bookmarkStart w:id="7" w:name="p0001_r0007"/>
       <w:r>
@@ -297,9 +215,9 @@
               <wp:posOffset>3061547</wp:posOffset>
             </wp:positionH>
             <wp:positionV relativeFrom="page">
-              <wp:posOffset>873011</wp:posOffset>
+              <wp:posOffset>868441</wp:posOffset>
             </wp:positionV>
-            <wp:extent cx="1549051" cy="109698"/>
+            <wp:extent cx="1539912" cy="109698"/>
             <wp:effectExtent l="0" t="0" r="0" b="0"/>
             <wp:wrapNone/>
             <wp:docPr id="7" name="Region 7"/>
@@ -325,7 +243,7 @@
                           <w:rPr>
                             <w:sz w:val="14"/>
                           </w:rPr>
-                          <w:t>Please check as applicable!</w:t>
+                          <w:t>Please tick as applicable!</w:t>
                         </w:r>
                       </w:p>
                     </w:txbxContent>
@@ -347,9 +265,9 @@
               <wp:posOffset>534628</wp:posOffset>
             </wp:positionH>
             <wp:positionV relativeFrom="page">
-              <wp:posOffset>1366651</wp:posOffset>
+              <wp:posOffset>1371222</wp:posOffset>
             </wp:positionV>
-            <wp:extent cx="1590177" cy="114269"/>
+            <wp:extent cx="1585607" cy="109698"/>
             <wp:effectExtent l="0" t="0" r="0" b="0"/>
             <wp:wrapNone/>
             <wp:docPr id="8" name="Region 8"/>
@@ -394,12 +312,12 @@
           <wp:anchor distT="0" distB="0" distL="0" distR="0" simplePos="0" relativeHeight="9" behindDoc="0" locked="0" layoutInCell="1" allowOverlap="1">
             <wp:simplePos x="0" y="0"/>
             <wp:positionH relativeFrom="page">
-              <wp:posOffset>534628</wp:posOffset>
+              <wp:posOffset>539198</wp:posOffset>
             </wp:positionH>
             <wp:positionV relativeFrom="page">
               <wp:posOffset>1503774</wp:posOffset>
             </wp:positionV>
-            <wp:extent cx="109667" cy="100556"/>
+            <wp:extent cx="105098" cy="105127"/>
             <wp:effectExtent l="0" t="0" r="0" b="0"/>
             <wp:wrapNone/>
             <wp:docPr id="9" name="Region 9"/>
@@ -447,9 +365,9 @@
               <wp:posOffset>717407</wp:posOffset>
             </wp:positionH>
             <wp:positionV relativeFrom="page">
-              <wp:posOffset>1517486</wp:posOffset>
+              <wp:posOffset>1512915</wp:posOffset>
             </wp:positionV>
-            <wp:extent cx="1859776" cy="402225"/>
+            <wp:extent cx="1740969" cy="406796"/>
             <wp:effectExtent l="0" t="0" r="0" b="0"/>
             <wp:wrapNone/>
             <wp:docPr id="10" name="Region 10"/>
@@ -476,8 +394,8 @@
                             <w:sz w:val="16"/>
                           </w:rPr>
                           <w:t>serious illnesses since
-the last examination, opera-
-tions, seizures</w:t>
+the last examination, operatio-
+ns, seizures</w:t>
                         </w:r>
                       </w:p>
                     </w:txbxContent>
@@ -496,12 +414,12 @@
           <wp:anchor distT="0" distB="0" distL="0" distR="0" simplePos="0" relativeHeight="11" behindDoc="0" locked="0" layoutInCell="1" allowOverlap="1">
             <wp:simplePos x="0" y="0"/>
             <wp:positionH relativeFrom="page">
-              <wp:posOffset>534628</wp:posOffset>
+              <wp:posOffset>539198</wp:posOffset>
             </wp:positionH>
             <wp:positionV relativeFrom="page">
               <wp:posOffset>1960848</wp:posOffset>
             </wp:positionV>
-            <wp:extent cx="109667" cy="105127"/>
+            <wp:extent cx="105098" cy="105127"/>
             <wp:effectExtent l="0" t="0" r="0" b="0"/>
             <wp:wrapNone/>
             <wp:docPr id="11" name="Region 11"/>
@@ -551,7 +469,7 @@
             <wp:positionV relativeFrom="page">
               <wp:posOffset>1969989</wp:posOffset>
             </wp:positionV>
-            <wp:extent cx="1841498" cy="260532"/>
+            <wp:extent cx="1795803" cy="255961"/>
             <wp:effectExtent l="0" t="0" r="0" b="0"/>
             <wp:wrapNone/>
             <wp:docPr id="12" name="Region 12"/>
@@ -575,10 +493,10 @@
                       <w:p>
                         <w:r>
                           <w:rPr>
-                            <w:sz w:val="16"/>
+                            <w:sz w:val="14"/>
                           </w:rPr>
-                          <w:t>difficulty drinking and feed-
-ing, vomiting, swallowing disorders</w:t>
+                          <w:t>difficulty drinking and fee-
+ding, vomiting, swallowing disorders</w:t>
                         </w:r>
                       </w:p>
                     </w:txbxContent>
@@ -602,7 +520,7 @@
             <wp:positionV relativeFrom="page">
               <wp:posOffset>1348369</wp:posOffset>
             </wp:positionV>
-            <wp:extent cx="109667" cy="105127"/>
+            <wp:extent cx="105098" cy="105127"/>
             <wp:effectExtent l="0" t="0" r="0" b="0"/>
             <wp:wrapNone/>
             <wp:docPr id="13" name="Region 13"/>
@@ -650,9 +568,9 @@
               <wp:posOffset>2910754</wp:posOffset>
             </wp:positionH>
             <wp:positionV relativeFrom="page">
-              <wp:posOffset>1362081</wp:posOffset>
+              <wp:posOffset>1357510</wp:posOffset>
             </wp:positionV>
-            <wp:extent cx="1836928" cy="260532"/>
+            <wp:extent cx="1800372" cy="255961"/>
             <wp:effectExtent l="0" t="0" r="0" b="0"/>
             <wp:wrapNone/>
             <wp:docPr id="14" name="Region 14"/>
@@ -703,7 +621,7 @@
             <wp:positionV relativeFrom="page">
               <wp:posOffset>1654608</wp:posOffset>
             </wp:positionV>
-            <wp:extent cx="109667" cy="105127"/>
+            <wp:extent cx="105098" cy="105127"/>
             <wp:effectExtent l="0" t="0" r="0" b="0"/>
             <wp:wrapNone/>
             <wp:docPr id="15" name="Region 15"/>
@@ -751,9 +669,9 @@
               <wp:posOffset>2910754</wp:posOffset>
             </wp:positionH>
             <wp:positionV relativeFrom="page">
-              <wp:posOffset>1668320</wp:posOffset>
+              <wp:posOffset>1663750</wp:posOffset>
             </wp:positionV>
-            <wp:extent cx="1156077" cy="118839"/>
+            <wp:extent cx="945881" cy="114269"/>
             <wp:effectExtent l="0" t="0" r="0" b="0"/>
             <wp:wrapNone/>
             <wp:docPr id="16" name="Region 16"/>
@@ -801,9 +719,9 @@
               <wp:posOffset>2732545</wp:posOffset>
             </wp:positionH>
             <wp:positionV relativeFrom="page">
-              <wp:posOffset>1974560</wp:posOffset>
+              <wp:posOffset>1979131</wp:posOffset>
             </wp:positionV>
-            <wp:extent cx="827075" cy="114269"/>
+            <wp:extent cx="840783" cy="109698"/>
             <wp:effectExtent l="0" t="0" r="0" b="0"/>
             <wp:wrapNone/>
             <wp:docPr id="17" name="Region 17"/>
@@ -853,7 +771,7 @@
             <wp:positionV relativeFrom="page">
               <wp:posOffset>2111682</wp:posOffset>
             </wp:positionV>
-            <wp:extent cx="109667" cy="105127"/>
+            <wp:extent cx="105098" cy="105127"/>
             <wp:effectExtent l="0" t="0" r="0" b="0"/>
             <wp:wrapNone/>
             <wp:docPr id="18" name="Region 18"/>
@@ -901,9 +819,9 @@
               <wp:posOffset>2910754</wp:posOffset>
             </wp:positionH>
             <wp:positionV relativeFrom="page">
-              <wp:posOffset>2125394</wp:posOffset>
+              <wp:posOffset>2120824</wp:posOffset>
             </wp:positionV>
-            <wp:extent cx="1028131" cy="114269"/>
+            <wp:extent cx="959589" cy="114269"/>
             <wp:effectExtent l="0" t="0" r="0" b="0"/>
             <wp:wrapNone/>
             <wp:docPr id="19" name="Region 19"/>
@@ -951,9 +869,9 @@
               <wp:posOffset>2732545</wp:posOffset>
             </wp:positionH>
             <wp:positionV relativeFrom="page">
-              <wp:posOffset>2267087</wp:posOffset>
+              <wp:posOffset>2262517</wp:posOffset>
             </wp:positionV>
-            <wp:extent cx="109667" cy="105127"/>
+            <wp:extent cx="105098" cy="105127"/>
             <wp:effectExtent l="0" t="0" r="0" b="0"/>
             <wp:wrapNone/>
             <wp:docPr id="20" name="Region 20"/>
@@ -1001,9 +919,9 @@
               <wp:posOffset>2910754</wp:posOffset>
             </wp:positionH>
             <wp:positionV relativeFrom="page">
-              <wp:posOffset>2280800</wp:posOffset>
+              <wp:posOffset>2271658</wp:posOffset>
             </wp:positionV>
-            <wp:extent cx="1841498" cy="114269"/>
+            <wp:extent cx="1836928" cy="118839"/>
             <wp:effectExtent l="0" t="0" r="0" b="0"/>
             <wp:wrapNone/>
             <wp:docPr id="21" name="Region 21"/>
@@ -1029,7 +947,7 @@
                           <w:rPr>
                             <w:sz w:val="14"/>
                           </w:rPr>
-                          <w:t>special burdens in the family</w:t>
+                          <w:t>special family burdens</w:t>
                         </w:r>
                       </w:p>
                     </w:txbxContent>
@@ -1051,9 +969,9 @@
               <wp:posOffset>534628</wp:posOffset>
             </wp:positionH>
             <wp:positionV relativeFrom="page">
-              <wp:posOffset>2952699</wp:posOffset>
+              <wp:posOffset>2961840</wp:posOffset>
             </wp:positionV>
-            <wp:extent cx="4281596" cy="237679"/>
+            <wp:extent cx="4258749" cy="242249"/>
             <wp:effectExtent l="0" t="0" r="0" b="0"/>
             <wp:wrapNone/>
             <wp:docPr id="22" name="Region 22"/>
@@ -1079,7 +997,7 @@
                           <w:rPr>
                             <w:sz w:val="22"/>
                           </w:rPr>
-                          <w:t>Guidance assessment of development</w:t>
+                          <w:t>General assessment of development</w:t>
                         </w:r>
                       </w:p>
                     </w:txbxContent>
@@ -1101,9 +1019,9 @@
               <wp:posOffset>534628</wp:posOffset>
             </wp:positionH>
             <wp:positionV relativeFrom="page">
-              <wp:posOffset>3281792</wp:posOffset>
+              <wp:posOffset>3286363</wp:posOffset>
             </wp:positionV>
-            <wp:extent cx="246751" cy="242249"/>
+            <wp:extent cx="242182" cy="237678"/>
             <wp:wrapNone/>
             <wp:docPr id="23" name="Picture 23"/>
             <wp:cNvGraphicFramePr>
@@ -1117,7 +1035,7 @@
                     <pic:cNvPicPr/>
                   </pic:nvPicPr>
                   <pic:blipFill>
-                    <a:blip r:embed="rId12"/>
+                    <a:blip r:embed="rId10"/>
                     <a:stretch>
                       <a:fillRect/>
                     </a:stretch>
@@ -1125,7 +1043,7 @@
                   <pic:spPr>
                     <a:xfrm>
                       <a:off x="0" y="0"/>
-                      <a:ext cx="246751" cy="242249"/>
+                      <a:ext cx="242182" cy="237678"/>
                     </a:xfrm>
                     <a:prstGeom prst="rect"/>
                   </pic:spPr>
@@ -1137,48 +1055,7 @@
       </w:r>
       <w:bookmarkEnd w:id="23"/>
       <w:bookmarkStart w:id="24" w:name="p0001_r0024"/>
-      <w:r>
-        <w:drawing>
-          <wp:anchor xmlns:a="http://schemas.openxmlformats.org/drawingml/2006/main" xmlns:pic="http://schemas.openxmlformats.org/drawingml/2006/picture" distT="0" distB="0" distL="0" distR="0" simplePos="0" relativeHeight="24" behindDoc="0" locked="0" layoutInCell="1" allowOverlap="1">
-            <wp:simplePos x="0" y="0"/>
-            <wp:positionH relativeFrom="page">
-              <wp:posOffset>758533</wp:posOffset>
-            </wp:positionH>
-            <wp:positionV relativeFrom="page">
-              <wp:posOffset>3304646</wp:posOffset>
-            </wp:positionV>
-            <wp:extent cx="4025705" cy="196541"/>
-            <wp:wrapNone/>
-            <wp:docPr id="24" name="Picture 24"/>
-            <wp:cNvGraphicFramePr>
-              <a:graphicFrameLocks noChangeAspect="1"/>
-            </wp:cNvGraphicFramePr>
-            <a:graphic>
-              <a:graphicData uri="http://schemas.openxmlformats.org/drawingml/2006/picture">
-                <pic:pic>
-                  <pic:nvPicPr>
-                    <pic:cNvPr id="0" name="image.png"/>
-                    <pic:cNvPicPr/>
-                  </pic:nvPicPr>
-                  <pic:blipFill>
-                    <a:blip r:embed="rId13"/>
-                    <a:stretch>
-                      <a:fillRect/>
-                    </a:stretch>
-                  </pic:blipFill>
-                  <pic:spPr>
-                    <a:xfrm>
-                      <a:off x="0" y="0"/>
-                      <a:ext cx="4025705" cy="196541"/>
-                    </a:xfrm>
-                    <a:prstGeom prst="rect"/>
-                  </pic:spPr>
-                </pic:pic>
-              </a:graphicData>
-            </a:graphic>
-          </wp:anchor>
-        </w:drawing>
-      </w:r>
+      <w:r/>
       <w:bookmarkEnd w:id="24"/>
       <w:bookmarkStart w:id="25" w:name="p0001_r0025"/>
       <w:r>
@@ -1191,7 +1068,7 @@
             <wp:positionV relativeFrom="page">
               <wp:posOffset>3359494</wp:posOffset>
             </wp:positionV>
-            <wp:extent cx="2846782" cy="109698"/>
+            <wp:extent cx="2595461" cy="109698"/>
             <wp:effectExtent l="0" t="0" r="0" b="0"/>
             <wp:wrapNone/>
             <wp:docPr id="25" name="Region 25"/>
@@ -1217,7 +1094,7 @@
                           <w:rPr>
                             <w:sz w:val="14"/>
                           </w:rPr>
-                          <w:t>Tick only if the items are NOT met!</w:t>
+                          <w:t>Only tick if items are NOT met!</w:t>
                         </w:r>
                       </w:p>
                     </w:txbxContent>
@@ -1236,221 +1113,15 @@
           <wp:anchor distT="0" distB="0" distL="0" distR="0" simplePos="0" relativeHeight="26" behindDoc="0" locked="0" layoutInCell="1" allowOverlap="1">
             <wp:simplePos x="0" y="0"/>
             <wp:positionH relativeFrom="page">
-              <wp:posOffset>534628</wp:posOffset>
+              <wp:posOffset>539198</wp:posOffset>
             </wp:positionH>
             <wp:positionV relativeFrom="page">
               <wp:posOffset>3784573</wp:posOffset>
             </wp:positionV>
-            <wp:extent cx="109667" cy="109698"/>
+            <wp:extent cx="105098" cy="105127"/>
             <wp:effectExtent l="0" t="0" r="0" b="0"/>
             <wp:wrapNone/>
             <wp:docPr id="26" name="Region 26"/>
-            <wp:cNvGraphicFramePr/>
-            <a:graphic xmlns:a="http://schemas.openxmlformats.org/drawingml/2006/main">
-              <a:graphicData uri="http://schemas.microsoft.com/office/word/2010/wordprocessingShape">
-                <wps:wsp>
-                  <wps:cNvSpPr/>
-                  <wps:spPr>
-                    <a:xfrm rot="0"/>
-                    <a:prstGeom prst="rect">
-                      <a:avLst/>
-                    </a:prstGeom>
-                    <a:noFill/>
-                    <a:ln w="12700">
-                      <a:noFill/>
-                    </a:ln>
-                  </wps:spPr>
-                  <wps:txbx>
-                    <w:txbxContent>
-                      <w:p>
-                        <w:r>
-                          <w:rPr>
-                            <w:sz w:val="14"/>
-                          </w:rPr>
-                          <w:t>☐</w:t>
-                        </w:r>
-                      </w:p>
-                    </w:txbxContent>
-                  </wps:txbx>
-                  <wps:bodyPr lIns="0" tIns="0" rIns="0" bIns="0"/>
-                </wps:wsp>
-              </a:graphicData>
-            </a:graphic>
-          </wp:anchor>
-        </w:drawing>
-      </w:r>
-      <w:bookmarkEnd w:id="26"/>
-      <w:bookmarkStart w:id="27" w:name="p0001_r0027"/>
-      <w:r>
-        <w:drawing>
-          <wp:anchor distT="0" distB="0" distL="0" distR="0" simplePos="0" relativeHeight="27" behindDoc="0" locked="0" layoutInCell="1" allowOverlap="1">
-            <wp:simplePos x="0" y="0"/>
-            <wp:positionH relativeFrom="page">
-              <wp:posOffset>717407</wp:posOffset>
-            </wp:positionH>
-            <wp:positionV relativeFrom="page">
-              <wp:posOffset>3798286</wp:posOffset>
-            </wp:positionV>
-            <wp:extent cx="689990" cy="114269"/>
-            <wp:effectExtent l="0" t="0" r="0" b="0"/>
-            <wp:wrapNone/>
-            <wp:docPr id="27" name="Region 27"/>
-            <wp:cNvGraphicFramePr/>
-            <a:graphic xmlns:a="http://schemas.openxmlformats.org/drawingml/2006/main">
-              <a:graphicData uri="http://schemas.microsoft.com/office/word/2010/wordprocessingShape">
-                <wps:wsp>
-                  <wps:cNvSpPr/>
-                  <wps:spPr>
-                    <a:xfrm rot="0"/>
-                    <a:prstGeom prst="rect">
-                      <a:avLst/>
-                    </a:prstGeom>
-                    <a:noFill/>
-                    <a:ln w="12700">
-                      <a:noFill/>
-                    </a:ln>
-                  </wps:spPr>
-                  <wps:txbx>
-                    <w:txbxContent>
-                      <w:p>
-                        <w:r>
-                          <w:rPr>
-                            <w:sz w:val="10"/>
-                          </w:rPr>
-                          <w:t>Gross motor skills:</w:t>
-                        </w:r>
-                      </w:p>
-                    </w:txbxContent>
-                  </wps:txbx>
-                  <wps:bodyPr lIns="0" tIns="0" rIns="0" bIns="0"/>
-                </wps:wsp>
-              </a:graphicData>
-            </a:graphic>
-          </wp:anchor>
-        </w:drawing>
-      </w:r>
-      <w:bookmarkEnd w:id="27"/>
-      <w:bookmarkStart w:id="28" w:name="p0001_r0028"/>
-      <w:r>
-        <w:drawing>
-          <wp:anchor distT="0" distB="0" distL="0" distR="0" simplePos="0" relativeHeight="28" behindDoc="0" locked="0" layoutInCell="1" allowOverlap="1">
-            <wp:simplePos x="0" y="0"/>
-            <wp:positionH relativeFrom="page">
-              <wp:posOffset>717407</wp:posOffset>
-            </wp:positionH>
-            <wp:positionV relativeFrom="page">
-              <wp:posOffset>3962832</wp:posOffset>
-            </wp:positionV>
-            <wp:extent cx="1836928" cy="1160968"/>
-            <wp:effectExtent l="0" t="0" r="0" b="0"/>
-            <wp:wrapNone/>
-            <wp:docPr id="28" name="Region 28"/>
-            <wp:cNvGraphicFramePr/>
-            <a:graphic xmlns:a="http://schemas.openxmlformats.org/drawingml/2006/main">
-              <a:graphicData uri="http://schemas.microsoft.com/office/word/2010/wordprocessingShape">
-                <wps:wsp>
-                  <wps:cNvSpPr/>
-                  <wps:spPr>
-                    <a:xfrm rot="0"/>
-                    <a:prstGeom prst="rect">
-                      <a:avLst/>
-                    </a:prstGeom>
-                    <a:noFill/>
-                    <a:ln w="12700">
-                      <a:noFill/>
-                    </a:ln>
-                  </wps:spPr>
-                  <wps:txbx>
-                    <w:txbxContent>
-                      <w:p>
-                        <w:r>
-                          <w:rPr>
-                            <w:sz w:val="14"/>
-                          </w:rPr>
-                          <w:t>Strong alternating and bilateral flexion
-and extension of the arms and legs.
-Holds head upright while sitting for at
-least 30 seconds. Tolerates prone
-position, supports on forearms, raises
-head between 40° and 90° when prone
-for at least one minute.</w:t>
-                        </w:r>
-                      </w:p>
-                    </w:txbxContent>
-                  </wps:txbx>
-                  <wps:bodyPr lIns="0" tIns="0" rIns="0" bIns="0"/>
-                </wps:wsp>
-              </a:graphicData>
-            </a:graphic>
-          </wp:anchor>
-        </w:drawing>
-      </w:r>
-      <w:bookmarkEnd w:id="28"/>
-      <w:bookmarkStart w:id="29" w:name="p0001_r0029"/>
-      <w:r>
-        <w:drawing>
-          <wp:anchor distT="0" distB="0" distL="0" distR="0" simplePos="0" relativeHeight="29" behindDoc="0" locked="0" layoutInCell="1" allowOverlap="1">
-            <wp:simplePos x="0" y="0"/>
-            <wp:positionH relativeFrom="page">
-              <wp:posOffset>2910754</wp:posOffset>
-            </wp:positionH>
-            <wp:positionV relativeFrom="page">
-              <wp:posOffset>3802856</wp:posOffset>
-            </wp:positionV>
-            <wp:extent cx="1750108" cy="260532"/>
-            <wp:effectExtent l="0" t="0" r="0" b="0"/>
-            <wp:wrapNone/>
-            <wp:docPr id="29" name="Region 29"/>
-            <wp:cNvGraphicFramePr/>
-            <a:graphic xmlns:a="http://schemas.openxmlformats.org/drawingml/2006/main">
-              <a:graphicData uri="http://schemas.microsoft.com/office/word/2010/wordprocessingShape">
-                <wps:wsp>
-                  <wps:cNvSpPr/>
-                  <wps:spPr>
-                    <a:xfrm rot="0"/>
-                    <a:prstGeom prst="rect">
-                      <a:avLst/>
-                    </a:prstGeom>
-                    <a:noFill/>
-                    <a:ln w="12700">
-                      <a:noFill/>
-                    </a:ln>
-                  </wps:spPr>
-                  <wps:txbx>
-                    <w:txbxContent>
-                      <w:p>
-                        <w:r>
-                          <w:rPr>
-                            <w:sz w:val="14"/>
-                          </w:rPr>
-                          <w:t>to see the source of a familiar sound.</w:t>
-                        </w:r>
-                      </w:p>
-                    </w:txbxContent>
-                  </wps:txbx>
-                  <wps:bodyPr lIns="0" tIns="0" rIns="0" bIns="0"/>
-                </wps:wsp>
-              </a:graphicData>
-            </a:graphic>
-          </wp:anchor>
-        </w:drawing>
-      </w:r>
-      <w:bookmarkEnd w:id="29"/>
-      <w:bookmarkStart w:id="30" w:name="p0001_r0030"/>
-      <w:r>
-        <w:drawing>
-          <wp:anchor distT="0" distB="0" distL="0" distR="0" simplePos="0" relativeHeight="30" behindDoc="0" locked="0" layoutInCell="1" allowOverlap="1">
-            <wp:simplePos x="0" y="0"/>
-            <wp:positionH relativeFrom="page">
-              <wp:posOffset>2732545</wp:posOffset>
-            </wp:positionH>
-            <wp:positionV relativeFrom="page">
-              <wp:posOffset>4246218</wp:posOffset>
-            </wp:positionV>
-            <wp:extent cx="109667" cy="105127"/>
-            <wp:effectExtent l="0" t="0" r="0" b="0"/>
-            <wp:wrapNone/>
-            <wp:docPr id="30" name="Region 30"/>
             <wp:cNvGraphicFramePr/>
             <a:graphic xmlns:a="http://schemas.openxmlformats.org/drawingml/2006/main">
               <a:graphicData uri="http://schemas.microsoft.com/office/word/2010/wordprocessingShape">
@@ -1485,22 +1156,80 @@
           </wp:anchor>
         </w:drawing>
       </w:r>
-      <w:bookmarkEnd w:id="30"/>
-      <w:bookmarkStart w:id="31" w:name="p0001_r0031"/>
+      <w:bookmarkEnd w:id="26"/>
+      <w:bookmarkStart w:id="27" w:name="p0001_r0027"/>
       <w:r>
         <w:drawing>
-          <wp:anchor distT="0" distB="0" distL="0" distR="0" simplePos="0" relativeHeight="31" behindDoc="0" locked="0" layoutInCell="1" allowOverlap="1">
+          <wp:anchor distT="0" distB="0" distL="0" distR="0" simplePos="0" relativeHeight="27" behindDoc="0" locked="0" layoutInCell="1" allowOverlap="1">
+            <wp:simplePos x="0" y="0"/>
+            <wp:positionH relativeFrom="page">
+              <wp:posOffset>717407</wp:posOffset>
+            </wp:positionH>
+            <wp:positionV relativeFrom="page">
+              <wp:posOffset>3798286</wp:posOffset>
+            </wp:positionV>
+            <wp:extent cx="1795803" cy="1320944"/>
+            <wp:effectExtent l="0" t="0" r="0" b="0"/>
+            <wp:wrapNone/>
+            <wp:docPr id="27" name="Region 27"/>
+            <wp:cNvGraphicFramePr/>
+            <a:graphic xmlns:a="http://schemas.openxmlformats.org/drawingml/2006/main">
+              <a:graphicData uri="http://schemas.microsoft.com/office/word/2010/wordprocessingShape">
+                <wps:wsp>
+                  <wps:cNvSpPr/>
+                  <wps:spPr>
+                    <a:xfrm rot="0"/>
+                    <a:prstGeom prst="rect">
+                      <a:avLst/>
+                    </a:prstGeom>
+                    <a:noFill/>
+                    <a:ln w="12700">
+                      <a:noFill/>
+                    </a:ln>
+                  </wps:spPr>
+                  <wps:txbx>
+                    <w:txbxContent>
+                      <w:p>
+                        <w:r>
+                          <w:rPr>
+                            <w:sz w:val="14"/>
+                          </w:rPr>
+                          <w:t>Gross motor skills:
+Strong alternating and bilateral flex-
+ion and extension of arms and legs.
+Holds head upright in sitting position
+for at least 30 seconds. Tolerates
+prone position, supports self on fore-
+arms, lifts head in prone position
+between 40° and 90° for at least one
+minute.</w:t>
+                        </w:r>
+                      </w:p>
+                    </w:txbxContent>
+                  </wps:txbx>
+                  <wps:bodyPr lIns="0" tIns="0" rIns="0" bIns="0"/>
+                </wps:wsp>
+              </a:graphicData>
+            </a:graphic>
+          </wp:anchor>
+        </w:drawing>
+      </w:r>
+      <w:bookmarkEnd w:id="27"/>
+      <w:bookmarkStart w:id="28" w:name="p0001_r0028"/>
+      <w:r>
+        <w:drawing>
+          <wp:anchor distT="0" distB="0" distL="0" distR="0" simplePos="0" relativeHeight="28" behindDoc="0" locked="0" layoutInCell="1" allowOverlap="1">
             <wp:simplePos x="0" y="0"/>
             <wp:positionH relativeFrom="page">
               <wp:posOffset>2910754</wp:posOffset>
             </wp:positionH>
             <wp:positionV relativeFrom="page">
-              <wp:posOffset>4259930</wp:posOffset>
+              <wp:posOffset>3798286</wp:posOffset>
             </wp:positionV>
-            <wp:extent cx="694560" cy="114269"/>
+            <wp:extent cx="1823220" cy="251391"/>
             <wp:effectExtent l="0" t="0" r="0" b="0"/>
             <wp:wrapNone/>
-            <wp:docPr id="31" name="Region 31"/>
+            <wp:docPr id="28" name="Region 28"/>
             <wp:cNvGraphicFramePr/>
             <a:graphic xmlns:a="http://schemas.openxmlformats.org/drawingml/2006/main">
               <a:graphicData uri="http://schemas.microsoft.com/office/word/2010/wordprocessingShape">
@@ -1523,7 +1252,7 @@
                           <w:rPr>
                             <w:sz w:val="12"/>
                           </w:rPr>
-                          <w:t>Fine motor skills:</w:t>
+                          <w:t>to look toward sources of a familiar sound.</w:t>
                         </w:r>
                       </w:p>
                     </w:txbxContent>
@@ -1535,226 +1264,22 @@
           </wp:anchor>
         </w:drawing>
       </w:r>
-      <w:bookmarkEnd w:id="31"/>
-      <w:bookmarkStart w:id="32" w:name="p0001_r0032"/>
+      <w:bookmarkEnd w:id="28"/>
+      <w:bookmarkStart w:id="29" w:name="p0001_r0029"/>
       <w:r>
         <w:drawing>
-          <wp:anchor distT="0" distB="0" distL="0" distR="0" simplePos="0" relativeHeight="32" behindDoc="0" locked="0" layoutInCell="1" allowOverlap="1">
-            <wp:simplePos x="0" y="0"/>
-            <wp:positionH relativeFrom="page">
-              <wp:posOffset>2910754</wp:posOffset>
-            </wp:positionH>
-            <wp:positionV relativeFrom="page">
-              <wp:posOffset>4419906</wp:posOffset>
-            </wp:positionV>
-            <wp:extent cx="1777525" cy="260532"/>
-            <wp:effectExtent l="0" t="0" r="0" b="0"/>
-            <wp:wrapNone/>
-            <wp:docPr id="32" name="Region 32"/>
-            <wp:cNvGraphicFramePr/>
-            <a:graphic xmlns:a="http://schemas.openxmlformats.org/drawingml/2006/main">
-              <a:graphicData uri="http://schemas.microsoft.com/office/word/2010/wordprocessingShape">
-                <wps:wsp>
-                  <wps:cNvSpPr/>
-                  <wps:spPr>
-                    <a:xfrm rot="0"/>
-                    <a:prstGeom prst="rect">
-                      <a:avLst/>
-                    </a:prstGeom>
-                    <a:noFill/>
-                    <a:ln w="12700">
-                      <a:noFill/>
-                    </a:ln>
-                  </wps:spPr>
-                  <wps:txbx>
-                    <w:txbxContent>
-                      <w:p>
-                        <w:r>
-                          <w:rPr>
-                            <w:sz w:val="16"/>
-                          </w:rPr>
-                          <w:t>Hands can spontaneously be brought
-to the midline.</w:t>
-                        </w:r>
-                      </w:p>
-                    </w:txbxContent>
-                  </wps:txbx>
-                  <wps:bodyPr lIns="0" tIns="0" rIns="0" bIns="0"/>
-                </wps:wsp>
-              </a:graphicData>
-            </a:graphic>
-          </wp:anchor>
-        </w:drawing>
-      </w:r>
-      <w:bookmarkEnd w:id="32"/>
-      <w:bookmarkStart w:id="33" w:name="p0001_r0033"/>
-      <w:r>
-        <w:drawing>
-          <wp:anchor distT="0" distB="0" distL="0" distR="0" simplePos="0" relativeHeight="33" behindDoc="0" locked="0" layoutInCell="1" allowOverlap="1">
+          <wp:anchor distT="0" distB="0" distL="0" distR="0" simplePos="0" relativeHeight="29" behindDoc="0" locked="0" layoutInCell="1" allowOverlap="1">
             <wp:simplePos x="0" y="0"/>
             <wp:positionH relativeFrom="page">
               <wp:posOffset>2732545</wp:posOffset>
             </wp:positionH>
             <wp:positionV relativeFrom="page">
-              <wp:posOffset>4854127</wp:posOffset>
+              <wp:posOffset>4246218</wp:posOffset>
             </wp:positionV>
-            <wp:extent cx="109667" cy="109698"/>
+            <wp:extent cx="105098" cy="105127"/>
             <wp:effectExtent l="0" t="0" r="0" b="0"/>
             <wp:wrapNone/>
-            <wp:docPr id="33" name="Region 33"/>
-            <wp:cNvGraphicFramePr/>
-            <a:graphic xmlns:a="http://schemas.openxmlformats.org/drawingml/2006/main">
-              <a:graphicData uri="http://schemas.microsoft.com/office/word/2010/wordprocessingShape">
-                <wps:wsp>
-                  <wps:cNvSpPr/>
-                  <wps:spPr>
-                    <a:xfrm rot="0"/>
-                    <a:prstGeom prst="rect">
-                      <a:avLst/>
-                    </a:prstGeom>
-                    <a:noFill/>
-                    <a:ln w="12700">
-                      <a:noFill/>
-                    </a:ln>
-                  </wps:spPr>
-                  <wps:txbx>
-                    <w:txbxContent>
-                      <w:p>
-                        <w:r>
-                          <w:rPr>
-                            <w:sz w:val="14"/>
-                          </w:rPr>
-                          <w:t>☐</w:t>
-                        </w:r>
-                      </w:p>
-                    </w:txbxContent>
-                  </wps:txbx>
-                  <wps:bodyPr lIns="0" tIns="0" rIns="0" bIns="0"/>
-                </wps:wsp>
-              </a:graphicData>
-            </a:graphic>
-          </wp:anchor>
-        </w:drawing>
-      </w:r>
-      <w:bookmarkEnd w:id="33"/>
-      <w:bookmarkStart w:id="34" w:name="p0001_r0034"/>
-      <w:r>
-        <w:drawing>
-          <wp:anchor distT="0" distB="0" distL="0" distR="0" simplePos="0" relativeHeight="34" behindDoc="0" locked="0" layoutInCell="1" allowOverlap="1">
-            <wp:simplePos x="0" y="0"/>
-            <wp:positionH relativeFrom="page">
-              <wp:posOffset>2910754</wp:posOffset>
-            </wp:positionH>
-            <wp:positionV relativeFrom="page">
-              <wp:posOffset>4876980</wp:posOffset>
-            </wp:positionV>
-            <wp:extent cx="1800372" cy="114269"/>
-            <wp:effectExtent l="0" t="0" r="0" b="0"/>
-            <wp:wrapNone/>
-            <wp:docPr id="34" name="Region 34"/>
-            <wp:cNvGraphicFramePr/>
-            <a:graphic xmlns:a="http://schemas.openxmlformats.org/drawingml/2006/main">
-              <a:graphicData uri="http://schemas.microsoft.com/office/word/2010/wordprocessingShape">
-                <wps:wsp>
-                  <wps:cNvSpPr/>
-                  <wps:spPr>
-                    <a:xfrm rot="0"/>
-                    <a:prstGeom prst="rect">
-                      <a:avLst/>
-                    </a:prstGeom>
-                    <a:noFill/>
-                    <a:ln w="12700">
-                      <a:noFill/>
-                    </a:ln>
-                  </wps:spPr>
-                  <wps:txbx>
-                    <w:txbxContent>
-                      <w:p>
-                        <w:r>
-                          <w:rPr>
-                            <w:sz w:val="14"/>
-                          </w:rPr>
-                          <w:t>Social/emotional competence:</w:t>
-                        </w:r>
-                      </w:p>
-                    </w:txbxContent>
-                  </wps:txbx>
-                  <wps:bodyPr lIns="0" tIns="0" rIns="0" bIns="0"/>
-                </wps:wsp>
-              </a:graphicData>
-            </a:graphic>
-          </wp:anchor>
-        </w:drawing>
-      </w:r>
-      <w:bookmarkEnd w:id="34"/>
-      <w:bookmarkStart w:id="35" w:name="p0001_r0035"/>
-      <w:r>
-        <w:drawing>
-          <wp:anchor distT="0" distB="0" distL="0" distR="0" simplePos="0" relativeHeight="35" behindDoc="0" locked="0" layoutInCell="1" allowOverlap="1">
-            <wp:simplePos x="0" y="0"/>
-            <wp:positionH relativeFrom="page">
-              <wp:posOffset>2910754</wp:posOffset>
-            </wp:positionH>
-            <wp:positionV relativeFrom="page">
-              <wp:posOffset>5032386</wp:posOffset>
-            </wp:positionV>
-            <wp:extent cx="1809511" cy="699323"/>
-            <wp:effectExtent l="0" t="0" r="0" b="0"/>
-            <wp:wrapNone/>
-            <wp:docPr id="35" name="Region 35"/>
-            <wp:cNvGraphicFramePr/>
-            <a:graphic xmlns:a="http://schemas.openxmlformats.org/drawingml/2006/main">
-              <a:graphicData uri="http://schemas.microsoft.com/office/word/2010/wordprocessingShape">
-                <wps:wsp>
-                  <wps:cNvSpPr/>
-                  <wps:spPr>
-                    <a:xfrm rot="0"/>
-                    <a:prstGeom prst="rect">
-                      <a:avLst/>
-                    </a:prstGeom>
-                    <a:noFill/>
-                    <a:ln w="12700">
-                      <a:noFill/>
-                    </a:ln>
-                  </wps:spPr>
-                  <wps:txbx>
-                    <w:txbxContent>
-                      <w:p>
-                        <w:r>
-                          <w:rPr>
-                            <w:sz w:val="14"/>
-                          </w:rPr>
-                          <w:t>Child enjoys attention and can maintain
-eye contact. Responds when spoken to,
-returns a caregiver’s smile (“social
-smile”).</w:t>
-                        </w:r>
-                      </w:p>
-                    </w:txbxContent>
-                  </wps:txbx>
-                  <wps:bodyPr lIns="0" tIns="0" rIns="0" bIns="0"/>
-                </wps:wsp>
-              </a:graphicData>
-            </a:graphic>
-          </wp:anchor>
-        </w:drawing>
-      </w:r>
-      <w:bookmarkEnd w:id="35"/>
-      <w:bookmarkStart w:id="36" w:name="p0001_r0036"/>
-      <w:r>
-        <w:drawing>
-          <wp:anchor distT="0" distB="0" distL="0" distR="0" simplePos="0" relativeHeight="36" behindDoc="0" locked="0" layoutInCell="1" allowOverlap="1">
-            <wp:simplePos x="0" y="0"/>
-            <wp:positionH relativeFrom="page">
-              <wp:posOffset>534628</wp:posOffset>
-            </wp:positionH>
-            <wp:positionV relativeFrom="page">
-              <wp:posOffset>5311201</wp:posOffset>
-            </wp:positionV>
-            <wp:extent cx="109667" cy="105127"/>
-            <wp:effectExtent l="0" t="0" r="0" b="0"/>
-            <wp:wrapNone/>
-            <wp:docPr id="36" name="Region 36"/>
+            <wp:docPr id="29" name="Region 29"/>
             <wp:cNvGraphicFramePr/>
             <a:graphic xmlns:a="http://schemas.openxmlformats.org/drawingml/2006/main">
               <a:graphicData uri="http://schemas.microsoft.com/office/word/2010/wordprocessingShape">
@@ -1789,22 +1314,22 @@
           </wp:anchor>
         </w:drawing>
       </w:r>
-      <w:bookmarkEnd w:id="36"/>
-      <w:bookmarkStart w:id="37" w:name="p0001_r0037"/>
+      <w:bookmarkEnd w:id="29"/>
+      <w:bookmarkStart w:id="30" w:name="p0001_r0030"/>
       <w:r>
         <w:drawing>
-          <wp:anchor distT="0" distB="0" distL="0" distR="0" simplePos="0" relativeHeight="37" behindDoc="0" locked="0" layoutInCell="1" allowOverlap="1">
+          <wp:anchor distT="0" distB="0" distL="0" distR="0" simplePos="0" relativeHeight="30" behindDoc="0" locked="0" layoutInCell="1" allowOverlap="1">
             <wp:simplePos x="0" y="0"/>
             <wp:positionH relativeFrom="page">
-              <wp:posOffset>717407</wp:posOffset>
+              <wp:posOffset>2910754</wp:posOffset>
             </wp:positionH>
             <wp:positionV relativeFrom="page">
-              <wp:posOffset>5329484</wp:posOffset>
+              <wp:posOffset>4259930</wp:posOffset>
             </wp:positionV>
-            <wp:extent cx="1137799" cy="114269"/>
+            <wp:extent cx="1759247" cy="402225"/>
             <wp:effectExtent l="0" t="0" r="0" b="0"/>
             <wp:wrapNone/>
-            <wp:docPr id="37" name="Region 37"/>
+            <wp:docPr id="30" name="Region 30"/>
             <wp:cNvGraphicFramePr/>
             <a:graphic xmlns:a="http://schemas.openxmlformats.org/drawingml/2006/main">
               <a:graphicData uri="http://schemas.microsoft.com/office/word/2010/wordprocessingShape">
@@ -1827,7 +1352,9 @@
                           <w:rPr>
                             <w:sz w:val="14"/>
                           </w:rPr>
-                          <w:t>Perception/cognition:</w:t>
+                          <w:t>Fine motor skills:
+Hands can spontaneously be brought to
+the midline.</w:t>
                         </w:r>
                       </w:p>
                     </w:txbxContent>
@@ -1839,22 +1366,22 @@
           </wp:anchor>
         </w:drawing>
       </w:r>
-      <w:bookmarkEnd w:id="37"/>
-      <w:bookmarkStart w:id="38" w:name="p0001_r0038"/>
+      <w:bookmarkEnd w:id="30"/>
+      <w:bookmarkStart w:id="31" w:name="p0001_r0031"/>
       <w:r>
         <w:drawing>
-          <wp:anchor distT="0" distB="0" distL="0" distR="0" simplePos="0" relativeHeight="38" behindDoc="0" locked="0" layoutInCell="1" allowOverlap="1">
+          <wp:anchor distT="0" distB="0" distL="0" distR="0" simplePos="0" relativeHeight="31" behindDoc="0" locked="0" layoutInCell="1" allowOverlap="1">
             <wp:simplePos x="0" y="0"/>
             <wp:positionH relativeFrom="page">
-              <wp:posOffset>717407</wp:posOffset>
+              <wp:posOffset>2732545</wp:posOffset>
             </wp:positionH>
             <wp:positionV relativeFrom="page">
-              <wp:posOffset>5484889</wp:posOffset>
+              <wp:posOffset>4854127</wp:posOffset>
             </wp:positionV>
-            <wp:extent cx="1891762" cy="260532"/>
+            <wp:extent cx="105098" cy="105127"/>
             <wp:effectExtent l="0" t="0" r="0" b="0"/>
             <wp:wrapNone/>
-            <wp:docPr id="38" name="Region 38"/>
+            <wp:docPr id="31" name="Region 31"/>
             <wp:cNvGraphicFramePr/>
             <a:graphic xmlns:a="http://schemas.openxmlformats.org/drawingml/2006/main">
               <a:graphicData uri="http://schemas.microsoft.com/office/word/2010/wordprocessingShape">
@@ -1875,9 +1402,164 @@
                       <w:p>
                         <w:r>
                           <w:rPr>
-                            <w:sz w:val="16"/>
+                            <w:sz w:val="12"/>
                           </w:rPr>
-                          <w:t>Fixates on a moving face and follows
+                          <w:t>☐</w:t>
+                        </w:r>
+                      </w:p>
+                    </w:txbxContent>
+                  </wps:txbx>
+                  <wps:bodyPr lIns="0" tIns="0" rIns="0" bIns="0"/>
+                </wps:wsp>
+              </a:graphicData>
+            </a:graphic>
+          </wp:anchor>
+        </w:drawing>
+      </w:r>
+      <w:bookmarkEnd w:id="31"/>
+      <w:bookmarkStart w:id="32" w:name="p0001_r0032"/>
+      <w:r>
+        <w:drawing>
+          <wp:anchor distT="0" distB="0" distL="0" distR="0" simplePos="0" relativeHeight="32" behindDoc="0" locked="0" layoutInCell="1" allowOverlap="1">
+            <wp:simplePos x="0" y="0"/>
+            <wp:positionH relativeFrom="page">
+              <wp:posOffset>2910754</wp:posOffset>
+            </wp:positionH>
+            <wp:positionV relativeFrom="page">
+              <wp:posOffset>4876980</wp:posOffset>
+            </wp:positionV>
+            <wp:extent cx="1850637" cy="850158"/>
+            <wp:effectExtent l="0" t="0" r="0" b="0"/>
+            <wp:wrapNone/>
+            <wp:docPr id="32" name="Region 32"/>
+            <wp:cNvGraphicFramePr/>
+            <a:graphic xmlns:a="http://schemas.openxmlformats.org/drawingml/2006/main">
+              <a:graphicData uri="http://schemas.microsoft.com/office/word/2010/wordprocessingShape">
+                <wps:wsp>
+                  <wps:cNvSpPr/>
+                  <wps:spPr>
+                    <a:xfrm rot="0"/>
+                    <a:prstGeom prst="rect">
+                      <a:avLst/>
+                    </a:prstGeom>
+                    <a:noFill/>
+                    <a:ln w="12700">
+                      <a:noFill/>
+                    </a:ln>
+                  </wps:spPr>
+                  <wps:txbx>
+                    <w:txbxContent>
+                      <w:p>
+                        <w:r>
+                          <w:rPr>
+                            <w:sz w:val="14"/>
+                          </w:rPr>
+                          <w:t>Social/emotional competence:
+Child enjoys attention and can maintain
+eye contact. Responds when spoken to,
+returns a caregiver’s smile (“social
+smile”).</w:t>
+                        </w:r>
+                      </w:p>
+                    </w:txbxContent>
+                  </wps:txbx>
+                  <wps:bodyPr lIns="0" tIns="0" rIns="0" bIns="0"/>
+                </wps:wsp>
+              </a:graphicData>
+            </a:graphic>
+          </wp:anchor>
+        </w:drawing>
+      </w:r>
+      <w:bookmarkEnd w:id="32"/>
+      <w:bookmarkStart w:id="33" w:name="p0001_r0033"/>
+      <w:r>
+        <w:drawing>
+          <wp:anchor distT="0" distB="0" distL="0" distR="0" simplePos="0" relativeHeight="33" behindDoc="0" locked="0" layoutInCell="1" allowOverlap="1">
+            <wp:simplePos x="0" y="0"/>
+            <wp:positionH relativeFrom="page">
+              <wp:posOffset>539198</wp:posOffset>
+            </wp:positionH>
+            <wp:positionV relativeFrom="page">
+              <wp:posOffset>5311201</wp:posOffset>
+            </wp:positionV>
+            <wp:extent cx="105098" cy="105127"/>
+            <wp:effectExtent l="0" t="0" r="0" b="0"/>
+            <wp:wrapNone/>
+            <wp:docPr id="33" name="Region 33"/>
+            <wp:cNvGraphicFramePr/>
+            <a:graphic xmlns:a="http://schemas.openxmlformats.org/drawingml/2006/main">
+              <a:graphicData uri="http://schemas.microsoft.com/office/word/2010/wordprocessingShape">
+                <wps:wsp>
+                  <wps:cNvSpPr/>
+                  <wps:spPr>
+                    <a:xfrm rot="0"/>
+                    <a:prstGeom prst="rect">
+                      <a:avLst/>
+                    </a:prstGeom>
+                    <a:noFill/>
+                    <a:ln w="12700">
+                      <a:noFill/>
+                    </a:ln>
+                  </wps:spPr>
+                  <wps:txbx>
+                    <w:txbxContent>
+                      <w:p>
+                        <w:r>
+                          <w:rPr>
+                            <w:sz w:val="12"/>
+                          </w:rPr>
+                          <w:t>☐</w:t>
+                        </w:r>
+                      </w:p>
+                    </w:txbxContent>
+                  </wps:txbx>
+                  <wps:bodyPr lIns="0" tIns="0" rIns="0" bIns="0"/>
+                </wps:wsp>
+              </a:graphicData>
+            </a:graphic>
+          </wp:anchor>
+        </w:drawing>
+      </w:r>
+      <w:bookmarkEnd w:id="33"/>
+      <w:bookmarkStart w:id="34" w:name="p0001_r0034"/>
+      <w:r>
+        <w:drawing>
+          <wp:anchor distT="0" distB="0" distL="0" distR="0" simplePos="0" relativeHeight="34" behindDoc="0" locked="0" layoutInCell="1" allowOverlap="1">
+            <wp:simplePos x="0" y="0"/>
+            <wp:positionH relativeFrom="page">
+              <wp:posOffset>717407</wp:posOffset>
+            </wp:positionH>
+            <wp:positionV relativeFrom="page">
+              <wp:posOffset>5329484</wp:posOffset>
+            </wp:positionV>
+            <wp:extent cx="1818650" cy="406796"/>
+            <wp:effectExtent l="0" t="0" r="0" b="0"/>
+            <wp:wrapNone/>
+            <wp:docPr id="34" name="Region 34"/>
+            <wp:cNvGraphicFramePr/>
+            <a:graphic xmlns:a="http://schemas.openxmlformats.org/drawingml/2006/main">
+              <a:graphicData uri="http://schemas.microsoft.com/office/word/2010/wordprocessingShape">
+                <wps:wsp>
+                  <wps:cNvSpPr/>
+                  <wps:spPr>
+                    <a:xfrm rot="0"/>
+                    <a:prstGeom prst="rect">
+                      <a:avLst/>
+                    </a:prstGeom>
+                    <a:noFill/>
+                    <a:ln w="12700">
+                      <a:noFill/>
+                    </a:ln>
+                  </wps:spPr>
+                  <wps:txbx>
+                    <w:txbxContent>
+                      <w:p>
+                        <w:r>
+                          <w:rPr>
+                            <w:sz w:val="14"/>
+                          </w:rPr>
+                          <w:t>Perception/cognition:
+Fixates on a moving face and follows
 it. Tries by turning the head,</w:t>
                         </w:r>
                       </w:p>
@@ -1890,22 +1572,22 @@
           </wp:anchor>
         </w:drawing>
       </w:r>
-      <w:bookmarkEnd w:id="38"/>
-      <w:bookmarkStart w:id="39" w:name="p0001_r0039"/>
+      <w:bookmarkEnd w:id="34"/>
+      <w:bookmarkStart w:id="35" w:name="p0001_r0035"/>
       <w:r>
         <w:drawing>
-          <wp:anchor distT="0" distB="0" distL="0" distR="0" simplePos="0" relativeHeight="39" behindDoc="0" locked="0" layoutInCell="1" allowOverlap="1">
+          <wp:anchor distT="0" distB="0" distL="0" distR="0" simplePos="0" relativeHeight="35" behindDoc="0" locked="0" layoutInCell="1" allowOverlap="1">
             <wp:simplePos x="0" y="0"/>
             <wp:positionH relativeFrom="page">
               <wp:posOffset>534628</wp:posOffset>
             </wp:positionH>
             <wp:positionV relativeFrom="page">
-              <wp:posOffset>6243632</wp:posOffset>
+              <wp:posOffset>6248203</wp:posOffset>
             </wp:positionV>
-            <wp:extent cx="1471370" cy="114269"/>
+            <wp:extent cx="1466801" cy="114269"/>
             <wp:effectExtent l="0" t="0" r="0" b="0"/>
             <wp:wrapNone/>
-            <wp:docPr id="39" name="Region 39"/>
+            <wp:docPr id="35" name="Region 35"/>
             <wp:cNvGraphicFramePr/>
             <a:graphic xmlns:a="http://schemas.openxmlformats.org/drawingml/2006/main">
               <a:graphicData uri="http://schemas.microsoft.com/office/word/2010/wordprocessingShape">
@@ -1940,22 +1622,22 @@
           </wp:anchor>
         </w:drawing>
       </w:r>
-      <w:bookmarkEnd w:id="39"/>
-      <w:bookmarkStart w:id="40" w:name="p0001_r0040"/>
+      <w:bookmarkEnd w:id="35"/>
+      <w:bookmarkStart w:id="36" w:name="p0001_r0036"/>
       <w:r>
         <w:drawing>
-          <wp:anchor distT="0" distB="0" distL="0" distR="0" simplePos="0" relativeHeight="40" behindDoc="0" locked="0" layoutInCell="1" allowOverlap="1">
+          <wp:anchor distT="0" distB="0" distL="0" distR="0" simplePos="0" relativeHeight="36" behindDoc="0" locked="0" layoutInCell="1" allowOverlap="1">
             <wp:simplePos x="0" y="0"/>
             <wp:positionH relativeFrom="page">
               <wp:posOffset>534628</wp:posOffset>
             </wp:positionH>
             <wp:positionV relativeFrom="page">
-              <wp:posOffset>6394466</wp:posOffset>
+              <wp:posOffset>6399037</wp:posOffset>
             </wp:positionV>
-            <wp:extent cx="4213054" cy="557630"/>
+            <wp:extent cx="4208485" cy="557630"/>
             <wp:effectExtent l="0" t="0" r="0" b="0"/>
             <wp:wrapNone/>
-            <wp:docPr id="40" name="Region 40"/>
+            <wp:docPr id="36" name="Region 36"/>
             <wp:cNvGraphicFramePr/>
             <a:graphic xmlns:a="http://schemas.openxmlformats.org/drawingml/2006/main">
               <a:graphicData uri="http://schemas.microsoft.com/office/word/2010/wordprocessingShape">
@@ -1976,12 +1658,12 @@
                       <w:p>
                         <w:r>
                           <w:rPr>
-                            <w:sz w:val="18"/>
+                            <w:sz w:val="16"/>
                           </w:rPr>
-                          <w:t>In particular, the following child reactions may help the physician
-assess the child's mood, communication and self-regulation
-abilities in contact with the primary caregiver and support the
-physician-parent discussion:</w:t>
+                          <w:t>In particular, the following reactions of the child may provide the physician with
+clues for assessing the child's mood, communication and regulation
+abilities in contact with the primary caregiver and as a further basis
+for the physician-parent discussion:</w:t>
                         </w:r>
                       </w:p>
                     </w:txbxContent>
@@ -1993,22 +1675,22 @@
           </wp:anchor>
         </w:drawing>
       </w:r>
-      <w:bookmarkEnd w:id="40"/>
-      <w:bookmarkStart w:id="41" w:name="p0001_r0041"/>
+      <w:bookmarkEnd w:id="36"/>
+      <w:bookmarkStart w:id="37" w:name="p0001_r0037"/>
       <w:r>
         <w:drawing>
-          <wp:anchor distT="0" distB="0" distL="0" distR="0" simplePos="0" relativeHeight="41" behindDoc="0" locked="0" layoutInCell="1" allowOverlap="1">
+          <wp:anchor distT="0" distB="0" distL="0" distR="0" simplePos="0" relativeHeight="37" behindDoc="0" locked="0" layoutInCell="1" allowOverlap="1">
             <wp:simplePos x="0" y="0"/>
             <wp:positionH relativeFrom="page">
-              <wp:posOffset>4994434</wp:posOffset>
+              <wp:posOffset>4999004</wp:posOffset>
             </wp:positionH>
             <wp:positionV relativeFrom="page">
               <wp:posOffset>7258336</wp:posOffset>
             </wp:positionV>
-            <wp:extent cx="123376" cy="91415"/>
+            <wp:extent cx="114237" cy="95986"/>
             <wp:effectExtent l="0" t="0" r="0" b="0"/>
             <wp:wrapNone/>
-            <wp:docPr id="41" name="Region 41"/>
+            <wp:docPr id="37" name="Region 37"/>
             <wp:cNvGraphicFramePr/>
             <a:graphic xmlns:a="http://schemas.openxmlformats.org/drawingml/2006/main">
               <a:graphicData uri="http://schemas.microsoft.com/office/word/2010/wordprocessingShape">
@@ -2029,7 +1711,7 @@
                       <w:p>
                         <w:r>
                           <w:rPr>
-                            <w:sz w:val="10"/>
+                            <w:sz w:val="12"/>
                           </w:rPr>
                           <w:t>25</w:t>
                         </w:r>
@@ -2043,7 +1725,7 @@
           </wp:anchor>
         </w:drawing>
       </w:r>
-      <w:bookmarkEnd w:id="41"/>
+      <w:bookmarkEnd w:id="37"/>
     </w:p>
     <w:p>
       <w:pPr>
@@ -2059,65 +1741,24 @@
       <w:pPr>
         <w:spacing w:before="0" w:after="0" w:line="20" w:lineRule="exact"/>
       </w:pPr>
-      <w:bookmarkStart w:id="42" w:name="p0002_r0001"/>
+      <w:bookmarkStart w:id="38" w:name="p0002_r0001"/>
+      <w:r/>
+      <w:bookmarkEnd w:id="38"/>
+      <w:bookmarkStart w:id="39" w:name="p0002_r0002"/>
       <w:r>
         <w:drawing>
-          <wp:anchor xmlns:a="http://schemas.openxmlformats.org/drawingml/2006/main" xmlns:pic="http://schemas.openxmlformats.org/drawingml/2006/picture" distT="0" distB="0" distL="0" distR="0" simplePos="0" relativeHeight="42" behindDoc="0" locked="0" layoutInCell="1" allowOverlap="1">
-            <wp:simplePos x="0" y="0"/>
-            <wp:positionH relativeFrom="page">
-              <wp:posOffset>534628</wp:posOffset>
-            </wp:positionH>
-            <wp:positionV relativeFrom="page">
-              <wp:posOffset>0</wp:posOffset>
-            </wp:positionV>
-            <wp:extent cx="2033415" cy="425078"/>
-            <wp:wrapNone/>
-            <wp:docPr id="42" name="Picture 42"/>
-            <wp:cNvGraphicFramePr>
-              <a:graphicFrameLocks noChangeAspect="1"/>
-            </wp:cNvGraphicFramePr>
-            <a:graphic>
-              <a:graphicData uri="http://schemas.openxmlformats.org/drawingml/2006/picture">
-                <pic:pic>
-                  <pic:nvPicPr>
-                    <pic:cNvPr id="0" name="image.png"/>
-                    <pic:cNvPicPr/>
-                  </pic:nvPicPr>
-                  <pic:blipFill>
-                    <a:blip r:embed="rId14"/>
-                    <a:stretch>
-                      <a:fillRect/>
-                    </a:stretch>
-                  </pic:blipFill>
-                  <pic:spPr>
-                    <a:xfrm>
-                      <a:off x="0" y="0"/>
-                      <a:ext cx="2033415" cy="425078"/>
-                    </a:xfrm>
-                    <a:prstGeom prst="rect"/>
-                  </pic:spPr>
-                </pic:pic>
-              </a:graphicData>
-            </a:graphic>
-          </wp:anchor>
-        </w:drawing>
-      </w:r>
-      <w:bookmarkEnd w:id="42"/>
-      <w:bookmarkStart w:id="43" w:name="p0002_r0002"/>
-      <w:r>
-        <w:drawing>
-          <wp:anchor distT="0" distB="0" distL="0" distR="0" simplePos="0" relativeHeight="43" behindDoc="0" locked="0" layoutInCell="1" allowOverlap="1">
+          <wp:anchor distT="0" distB="0" distL="0" distR="0" simplePos="0" relativeHeight="39" behindDoc="0" locked="0" layoutInCell="1" allowOverlap="1">
             <wp:simplePos x="0" y="0"/>
             <wp:positionH relativeFrom="page">
               <wp:posOffset>648865</wp:posOffset>
             </wp:positionH>
             <wp:positionV relativeFrom="page">
-              <wp:posOffset>114269</wp:posOffset>
+              <wp:posOffset>127981</wp:posOffset>
             </wp:positionV>
-            <wp:extent cx="310724" cy="210254"/>
+            <wp:extent cx="301585" cy="191971"/>
             <wp:effectExtent l="0" t="0" r="0" b="0"/>
             <wp:wrapNone/>
-            <wp:docPr id="43" name="Region 43"/>
+            <wp:docPr id="39" name="Region 39"/>
             <wp:cNvGraphicFramePr/>
             <a:graphic xmlns:a="http://schemas.openxmlformats.org/drawingml/2006/main">
               <a:graphicData uri="http://schemas.microsoft.com/office/word/2010/wordprocessingShape">
@@ -2152,22 +1793,22 @@
           </wp:anchor>
         </w:drawing>
       </w:r>
-      <w:bookmarkEnd w:id="43"/>
-      <w:bookmarkStart w:id="44" w:name="p0002_r0003"/>
+      <w:bookmarkEnd w:id="39"/>
+      <w:bookmarkStart w:id="40" w:name="p0002_r0003"/>
       <w:r>
         <w:drawing>
-          <wp:anchor distT="0" distB="0" distL="0" distR="0" simplePos="0" relativeHeight="44" behindDoc="0" locked="0" layoutInCell="1" allowOverlap="1">
+          <wp:anchor distT="0" distB="0" distL="0" distR="0" simplePos="0" relativeHeight="40" behindDoc="0" locked="0" layoutInCell="1" allowOverlap="1">
             <wp:simplePos x="0" y="0"/>
             <wp:positionH relativeFrom="page">
-              <wp:posOffset>1338856</wp:posOffset>
+              <wp:posOffset>1343425</wp:posOffset>
             </wp:positionH>
             <wp:positionV relativeFrom="page">
-              <wp:posOffset>214825</wp:posOffset>
+              <wp:posOffset>219396</wp:posOffset>
             </wp:positionV>
-            <wp:extent cx="1119521" cy="132551"/>
+            <wp:extent cx="1110382" cy="118839"/>
             <wp:effectExtent l="0" t="0" r="0" b="0"/>
             <wp:wrapNone/>
-            <wp:docPr id="44" name="Region 44"/>
+            <wp:docPr id="40" name="Region 40"/>
             <wp:cNvGraphicFramePr/>
             <a:graphic xmlns:a="http://schemas.openxmlformats.org/drawingml/2006/main">
               <a:graphicData uri="http://schemas.microsoft.com/office/word/2010/wordprocessingShape">
@@ -2188,7 +1829,7 @@
                       <w:p>
                         <w:r>
                           <w:rPr>
-                            <w:sz w:val="16"/>
+                            <w:sz w:val="14"/>
                           </w:rPr>
                           <w:t>3rd–4th month of life</w:t>
                         </w:r>
@@ -2202,22 +1843,22 @@
           </wp:anchor>
         </w:drawing>
       </w:r>
-      <w:bookmarkEnd w:id="44"/>
-      <w:bookmarkStart w:id="45" w:name="p0002_r0004"/>
+      <w:bookmarkEnd w:id="40"/>
+      <w:bookmarkStart w:id="41" w:name="p0002_r0004"/>
       <w:r>
         <w:drawing>
-          <wp:anchor distT="0" distB="0" distL="0" distR="0" simplePos="0" relativeHeight="45" behindDoc="0" locked="0" layoutInCell="1" allowOverlap="1">
+          <wp:anchor distT="0" distB="0" distL="0" distR="0" simplePos="0" relativeHeight="41" behindDoc="0" locked="0" layoutInCell="1" allowOverlap="1">
             <wp:simplePos x="0" y="0"/>
             <wp:positionH relativeFrom="page">
               <wp:posOffset>534628</wp:posOffset>
             </wp:positionH>
             <wp:positionV relativeFrom="page">
-              <wp:posOffset>822733</wp:posOffset>
+              <wp:posOffset>809021</wp:posOffset>
             </wp:positionV>
-            <wp:extent cx="1092104" cy="219396"/>
+            <wp:extent cx="1087535" cy="242249"/>
             <wp:effectExtent l="0" t="0" r="0" b="0"/>
             <wp:wrapNone/>
-            <wp:docPr id="45" name="Region 45"/>
+            <wp:docPr id="41" name="Region 41"/>
             <wp:cNvGraphicFramePr/>
             <a:graphic xmlns:a="http://schemas.openxmlformats.org/drawingml/2006/main">
               <a:graphicData uri="http://schemas.microsoft.com/office/word/2010/wordprocessingShape">
@@ -2240,7 +1881,7 @@
                           <w:rPr>
                             <w:sz w:val="22"/>
                           </w:rPr>
-                          <w:t>Results</w:t>
+                          <w:t>Findings</w:t>
                         </w:r>
                       </w:p>
                     </w:txbxContent>
@@ -2252,11 +1893,11 @@
           </wp:anchor>
         </w:drawing>
       </w:r>
-      <w:bookmarkEnd w:id="45"/>
-      <w:bookmarkStart w:id="46" w:name="p0002_r0005"/>
+      <w:bookmarkEnd w:id="41"/>
+      <w:bookmarkStart w:id="42" w:name="p0002_r0005"/>
       <w:r>
         <w:drawing>
-          <wp:anchor distT="0" distB="0" distL="0" distR="0" simplePos="0" relativeHeight="46" behindDoc="0" locked="0" layoutInCell="1" allowOverlap="1">
+          <wp:anchor distT="0" distB="0" distL="0" distR="0" simplePos="0" relativeHeight="42" behindDoc="0" locked="0" layoutInCell="1" allowOverlap="1">
             <wp:simplePos x="0" y="0"/>
             <wp:positionH relativeFrom="page">
               <wp:posOffset>534628</wp:posOffset>
@@ -2264,10 +1905,10 @@
             <wp:positionV relativeFrom="page">
               <wp:posOffset>1138114</wp:posOffset>
             </wp:positionV>
-            <wp:extent cx="1859776" cy="114269"/>
+            <wp:extent cx="1878053" cy="109698"/>
             <wp:effectExtent l="0" t="0" r="0" b="0"/>
             <wp:wrapNone/>
-            <wp:docPr id="46" name="Region 46"/>
+            <wp:docPr id="42" name="Region 42"/>
             <wp:cNvGraphicFramePr/>
             <a:graphic xmlns:a="http://schemas.openxmlformats.org/drawingml/2006/main">
               <a:graphicData uri="http://schemas.microsoft.com/office/word/2010/wordprocessingShape">
@@ -2302,11 +1943,11 @@
           </wp:anchor>
         </w:drawing>
       </w:r>
-      <w:bookmarkEnd w:id="46"/>
-      <w:bookmarkStart w:id="47" w:name="p0002_r0006"/>
+      <w:bookmarkEnd w:id="42"/>
+      <w:bookmarkStart w:id="43" w:name="p0002_r0006"/>
       <w:r>
         <w:drawing>
-          <wp:anchor distT="0" distB="0" distL="0" distR="0" simplePos="0" relativeHeight="47" behindDoc="0" locked="0" layoutInCell="1" allowOverlap="1">
+          <wp:anchor distT="0" distB="0" distL="0" distR="0" simplePos="0" relativeHeight="43" behindDoc="0" locked="0" layoutInCell="1" allowOverlap="1">
             <wp:simplePos x="0" y="0"/>
             <wp:positionH relativeFrom="page">
               <wp:posOffset>534628</wp:posOffset>
@@ -2314,10 +1955,10 @@
             <wp:positionV relativeFrom="page">
               <wp:posOffset>1293520</wp:posOffset>
             </wp:positionV>
-            <wp:extent cx="4254180" cy="9141"/>
+            <wp:extent cx="4249610" cy="9141"/>
             <wp:effectExtent l="0" t="0" r="0" b="0"/>
             <wp:wrapNone/>
-            <wp:docPr id="47" name="Region 47"/>
+            <wp:docPr id="43" name="Region 43"/>
             <wp:cNvGraphicFramePr/>
             <a:graphic xmlns:a="http://schemas.openxmlformats.org/drawingml/2006/main">
               <a:graphicData uri="http://schemas.microsoft.com/office/word/2010/wordprocessingShape">
@@ -2341,11 +1982,11 @@
           </wp:anchor>
         </w:drawing>
       </w:r>
-      <w:bookmarkEnd w:id="47"/>
-      <w:bookmarkStart w:id="48" w:name="p0002_r0007"/>
+      <w:bookmarkEnd w:id="43"/>
+      <w:bookmarkStart w:id="44" w:name="p0002_r0007"/>
       <w:r>
         <w:drawing>
-          <wp:anchor distT="0" distB="0" distL="0" distR="0" simplePos="0" relativeHeight="48" behindDoc="0" locked="0" layoutInCell="1" allowOverlap="1">
+          <wp:anchor distT="0" distB="0" distL="0" distR="0" simplePos="0" relativeHeight="44" behindDoc="0" locked="0" layoutInCell="1" allowOverlap="1">
             <wp:simplePos x="0" y="0"/>
             <wp:positionH relativeFrom="page">
               <wp:posOffset>534628</wp:posOffset>
@@ -2353,10 +1994,10 @@
             <wp:positionV relativeFrom="page">
               <wp:posOffset>1604330</wp:posOffset>
             </wp:positionV>
-            <wp:extent cx="4254180" cy="9141"/>
+            <wp:extent cx="4249610" cy="9141"/>
             <wp:effectExtent l="0" t="0" r="0" b="0"/>
             <wp:wrapNone/>
-            <wp:docPr id="48" name="Region 48"/>
+            <wp:docPr id="44" name="Region 44"/>
             <wp:cNvGraphicFramePr/>
             <a:graphic xmlns:a="http://schemas.openxmlformats.org/drawingml/2006/main">
               <a:graphicData uri="http://schemas.microsoft.com/office/word/2010/wordprocessingShape">
@@ -2380,11 +2021,11 @@
           </wp:anchor>
         </w:drawing>
       </w:r>
-      <w:bookmarkEnd w:id="48"/>
-      <w:bookmarkStart w:id="49" w:name="p0002_r0008"/>
+      <w:bookmarkEnd w:id="44"/>
+      <w:bookmarkStart w:id="45" w:name="p0002_r0008"/>
       <w:r>
         <w:drawing>
-          <wp:anchor distT="0" distB="0" distL="0" distR="0" simplePos="0" relativeHeight="49" behindDoc="0" locked="0" layoutInCell="1" allowOverlap="1">
+          <wp:anchor distT="0" distB="0" distL="0" distR="0" simplePos="0" relativeHeight="45" behindDoc="0" locked="0" layoutInCell="1" allowOverlap="1">
             <wp:simplePos x="0" y="0"/>
             <wp:positionH relativeFrom="page">
               <wp:posOffset>534628</wp:posOffset>
@@ -2392,10 +2033,10 @@
             <wp:positionV relativeFrom="page">
               <wp:posOffset>1828296</wp:posOffset>
             </wp:positionV>
-            <wp:extent cx="3002144" cy="114269"/>
+            <wp:extent cx="2983866" cy="109698"/>
             <wp:effectExtent l="0" t="0" r="0" b="0"/>
             <wp:wrapNone/>
-            <wp:docPr id="49" name="Region 49"/>
+            <wp:docPr id="45" name="Region 45"/>
             <wp:cNvGraphicFramePr/>
             <a:graphic xmlns:a="http://schemas.openxmlformats.org/drawingml/2006/main">
               <a:graphicData uri="http://schemas.microsoft.com/office/word/2010/wordprocessingShape">
@@ -2418,7 +2059,7 @@
                           <w:rPr>
                             <w:sz w:val="14"/>
                           </w:rPr>
-                          <w:t>Age-appropriate developmental screening:</w:t>
+                          <w:t>General assessment of age-appropriate development:</w:t>
                         </w:r>
                       </w:p>
                     </w:txbxContent>
@@ -2430,11 +2071,11 @@
           </wp:anchor>
         </w:drawing>
       </w:r>
-      <w:bookmarkEnd w:id="49"/>
-      <w:bookmarkStart w:id="50" w:name="p0002_r0009"/>
+      <w:bookmarkEnd w:id="45"/>
+      <w:bookmarkStart w:id="46" w:name="p0002_r0009"/>
       <w:r>
         <w:drawing>
-          <wp:anchor distT="0" distB="0" distL="0" distR="0" simplePos="0" relativeHeight="50" behindDoc="0" locked="0" layoutInCell="1" allowOverlap="1">
+          <wp:anchor distT="0" distB="0" distL="0" distR="0" simplePos="0" relativeHeight="46" behindDoc="0" locked="0" layoutInCell="1" allowOverlap="1">
             <wp:simplePos x="0" y="0"/>
             <wp:positionH relativeFrom="page">
               <wp:posOffset>3966303</wp:posOffset>
@@ -2442,10 +2083,10 @@
             <wp:positionV relativeFrom="page">
               <wp:posOffset>1805443</wp:posOffset>
             </wp:positionV>
-            <wp:extent cx="109667" cy="105127"/>
+            <wp:extent cx="105098" cy="105127"/>
             <wp:effectExtent l="0" t="0" r="0" b="0"/>
             <wp:wrapNone/>
-            <wp:docPr id="50" name="Region 50"/>
+            <wp:docPr id="46" name="Region 46"/>
             <wp:cNvGraphicFramePr/>
             <a:graphic xmlns:a="http://schemas.openxmlformats.org/drawingml/2006/main">
               <a:graphicData uri="http://schemas.microsoft.com/office/word/2010/wordprocessingShape">
@@ -2480,22 +2121,22 @@
           </wp:anchor>
         </w:drawing>
       </w:r>
-      <w:bookmarkEnd w:id="50"/>
-      <w:bookmarkStart w:id="51" w:name="p0002_r0010"/>
+      <w:bookmarkEnd w:id="46"/>
+      <w:bookmarkStart w:id="47" w:name="p0002_r0010"/>
       <w:r>
         <w:drawing>
-          <wp:anchor distT="0" distB="0" distL="0" distR="0" simplePos="0" relativeHeight="51" behindDoc="0" locked="0" layoutInCell="1" allowOverlap="1">
+          <wp:anchor distT="0" distB="0" distL="0" distR="0" simplePos="0" relativeHeight="47" behindDoc="0" locked="0" layoutInCell="1" allowOverlap="1">
             <wp:simplePos x="0" y="0"/>
             <wp:positionH relativeFrom="page">
               <wp:posOffset>4139943</wp:posOffset>
             </wp:positionH>
             <wp:positionV relativeFrom="page">
-              <wp:posOffset>1823726</wp:posOffset>
+              <wp:posOffset>1832867</wp:posOffset>
             </wp:positionV>
-            <wp:extent cx="109667" cy="100556"/>
+            <wp:extent cx="100528" cy="95986"/>
             <wp:effectExtent l="0" t="0" r="0" b="0"/>
             <wp:wrapNone/>
-            <wp:docPr id="51" name="Region 51"/>
+            <wp:docPr id="47" name="Region 47"/>
             <wp:cNvGraphicFramePr/>
             <a:graphic xmlns:a="http://schemas.openxmlformats.org/drawingml/2006/main">
               <a:graphicData uri="http://schemas.microsoft.com/office/word/2010/wordprocessingShape">
@@ -2530,11 +2171,11 @@
           </wp:anchor>
         </w:drawing>
       </w:r>
-      <w:bookmarkEnd w:id="51"/>
-      <w:bookmarkStart w:id="52" w:name="p0002_r0011"/>
+      <w:bookmarkEnd w:id="47"/>
+      <w:bookmarkStart w:id="48" w:name="p0002_r0011"/>
       <w:r>
         <w:drawing>
-          <wp:anchor distT="0" distB="0" distL="0" distR="0" simplePos="0" relativeHeight="52" behindDoc="0" locked="0" layoutInCell="1" allowOverlap="1">
+          <wp:anchor distT="0" distB="0" distL="0" distR="0" simplePos="0" relativeHeight="48" behindDoc="0" locked="0" layoutInCell="1" allowOverlap="1">
             <wp:simplePos x="0" y="0"/>
             <wp:positionH relativeFrom="page">
               <wp:posOffset>4395833</wp:posOffset>
@@ -2542,10 +2183,10 @@
             <wp:positionV relativeFrom="page">
               <wp:posOffset>1805443</wp:posOffset>
             </wp:positionV>
-            <wp:extent cx="109667" cy="105127"/>
+            <wp:extent cx="105098" cy="105127"/>
             <wp:effectExtent l="0" t="0" r="0" b="0"/>
             <wp:wrapNone/>
-            <wp:docPr id="52" name="Region 52"/>
+            <wp:docPr id="48" name="Region 48"/>
             <wp:cNvGraphicFramePr/>
             <a:graphic xmlns:a="http://schemas.openxmlformats.org/drawingml/2006/main">
               <a:graphicData uri="http://schemas.microsoft.com/office/word/2010/wordprocessingShape">
@@ -2580,22 +2221,22 @@
           </wp:anchor>
         </w:drawing>
       </w:r>
-      <w:bookmarkEnd w:id="52"/>
-      <w:bookmarkStart w:id="53" w:name="p0002_r0012"/>
+      <w:bookmarkEnd w:id="48"/>
+      <w:bookmarkStart w:id="49" w:name="p0002_r0012"/>
       <w:r>
         <w:drawing>
-          <wp:anchor distT="0" distB="0" distL="0" distR="0" simplePos="0" relativeHeight="53" behindDoc="0" locked="0" layoutInCell="1" allowOverlap="1">
+          <wp:anchor distT="0" distB="0" distL="0" distR="0" simplePos="0" relativeHeight="49" behindDoc="0" locked="0" layoutInCell="1" allowOverlap="1">
             <wp:simplePos x="0" y="0"/>
             <wp:positionH relativeFrom="page">
               <wp:posOffset>4574043</wp:posOffset>
             </wp:positionH>
             <wp:positionV relativeFrom="page">
-              <wp:posOffset>1823726</wp:posOffset>
+              <wp:posOffset>1832867</wp:posOffset>
             </wp:positionV>
-            <wp:extent cx="205626" cy="100556"/>
+            <wp:extent cx="205626" cy="95986"/>
             <wp:effectExtent l="0" t="0" r="0" b="0"/>
             <wp:wrapNone/>
-            <wp:docPr id="53" name="Region 53"/>
+            <wp:docPr id="49" name="Region 49"/>
             <wp:cNvGraphicFramePr/>
             <a:graphic xmlns:a="http://schemas.openxmlformats.org/drawingml/2006/main">
               <a:graphicData uri="http://schemas.microsoft.com/office/word/2010/wordprocessingShape">
@@ -2630,11 +2271,11 @@
           </wp:anchor>
         </w:drawing>
       </w:r>
-      <w:bookmarkEnd w:id="53"/>
-      <w:bookmarkStart w:id="54" w:name="p0002_r0013"/>
+      <w:bookmarkEnd w:id="49"/>
+      <w:bookmarkStart w:id="50" w:name="p0002_r0013"/>
       <w:r>
         <w:drawing>
-          <wp:anchor distT="0" distB="0" distL="0" distR="0" simplePos="0" relativeHeight="54" behindDoc="0" locked="0" layoutInCell="1" allowOverlap="1">
+          <wp:anchor distT="0" distB="0" distL="0" distR="0" simplePos="0" relativeHeight="50" behindDoc="0" locked="0" layoutInCell="1" allowOverlap="1">
             <wp:simplePos x="0" y="0"/>
             <wp:positionH relativeFrom="page">
               <wp:posOffset>534628</wp:posOffset>
@@ -2642,10 +2283,10 @@
             <wp:positionV relativeFrom="page">
               <wp:posOffset>1979131</wp:posOffset>
             </wp:positionV>
-            <wp:extent cx="4254180" cy="9141"/>
+            <wp:extent cx="4249610" cy="9141"/>
             <wp:effectExtent l="0" t="0" r="0" b="0"/>
             <wp:wrapNone/>
-            <wp:docPr id="54" name="Region 54"/>
+            <wp:docPr id="50" name="Region 50"/>
             <wp:cNvGraphicFramePr/>
             <a:graphic xmlns:a="http://schemas.openxmlformats.org/drawingml/2006/main">
               <a:graphicData uri="http://schemas.microsoft.com/office/word/2010/wordprocessingShape">
@@ -2669,22 +2310,22 @@
           </wp:anchor>
         </w:drawing>
       </w:r>
-      <w:bookmarkEnd w:id="54"/>
-      <w:bookmarkStart w:id="55" w:name="p0002_r0014"/>
+      <w:bookmarkEnd w:id="50"/>
+      <w:bookmarkStart w:id="51" w:name="p0002_r0014"/>
       <w:r>
         <w:drawing>
-          <wp:anchor distT="0" distB="0" distL="0" distR="0" simplePos="0" relativeHeight="55" behindDoc="0" locked="0" layoutInCell="1" allowOverlap="1">
+          <wp:anchor distT="0" distB="0" distL="0" distR="0" simplePos="0" relativeHeight="51" behindDoc="0" locked="0" layoutInCell="1" allowOverlap="1">
             <wp:simplePos x="0" y="0"/>
             <wp:positionH relativeFrom="page">
               <wp:posOffset>534628</wp:posOffset>
             </wp:positionH>
             <wp:positionV relativeFrom="page">
-              <wp:posOffset>2120824</wp:posOffset>
+              <wp:posOffset>2125394</wp:posOffset>
             </wp:positionV>
-            <wp:extent cx="658004" cy="114269"/>
+            <wp:extent cx="658004" cy="105127"/>
             <wp:effectExtent l="0" t="0" r="0" b="0"/>
             <wp:wrapNone/>
-            <wp:docPr id="55" name="Region 55"/>
+            <wp:docPr id="51" name="Region 51"/>
             <wp:cNvGraphicFramePr/>
             <a:graphic xmlns:a="http://schemas.openxmlformats.org/drawingml/2006/main">
               <a:graphicData uri="http://schemas.microsoft.com/office/word/2010/wordprocessingShape">
@@ -2719,11 +2360,11 @@
           </wp:anchor>
         </w:drawing>
       </w:r>
-      <w:bookmarkEnd w:id="55"/>
-      <w:bookmarkStart w:id="56" w:name="p0002_r0015"/>
+      <w:bookmarkEnd w:id="51"/>
+      <w:bookmarkStart w:id="52" w:name="p0002_r0015"/>
       <w:r>
         <w:drawing>
-          <wp:anchor distT="0" distB="0" distL="0" distR="0" simplePos="0" relativeHeight="56" behindDoc="0" locked="0" layoutInCell="1" allowOverlap="1">
+          <wp:anchor distT="0" distB="0" distL="0" distR="0" simplePos="0" relativeHeight="52" behindDoc="0" locked="0" layoutInCell="1" allowOverlap="1">
             <wp:simplePos x="0" y="0"/>
             <wp:positionH relativeFrom="page">
               <wp:posOffset>1562760</wp:posOffset>
@@ -2731,10 +2372,10 @@
             <wp:positionV relativeFrom="page">
               <wp:posOffset>2125394</wp:posOffset>
             </wp:positionV>
-            <wp:extent cx="923034" cy="105127"/>
+            <wp:extent cx="904756" cy="100556"/>
             <wp:effectExtent l="0" t="0" r="0" b="0"/>
             <wp:wrapNone/>
-            <wp:docPr id="56" name="Region 56"/>
+            <wp:docPr id="52" name="Region 52"/>
             <wp:cNvGraphicFramePr/>
             <a:graphic xmlns:a="http://schemas.openxmlformats.org/drawingml/2006/main">
               <a:graphicData uri="http://schemas.microsoft.com/office/word/2010/wordprocessingShape">
@@ -2769,11 +2410,11 @@
           </wp:anchor>
         </w:drawing>
       </w:r>
-      <w:bookmarkEnd w:id="56"/>
-      <w:bookmarkStart w:id="57" w:name="p0002_r0016"/>
+      <w:bookmarkEnd w:id="52"/>
+      <w:bookmarkStart w:id="53" w:name="p0002_r0016"/>
       <w:r>
         <w:drawing>
-          <wp:anchor distT="0" distB="0" distL="0" distR="0" simplePos="0" relativeHeight="57" behindDoc="0" locked="0" layoutInCell="1" allowOverlap="1">
+          <wp:anchor distT="0" distB="0" distL="0" distR="0" simplePos="0" relativeHeight="53" behindDoc="0" locked="0" layoutInCell="1" allowOverlap="1">
             <wp:simplePos x="0" y="0"/>
             <wp:positionH relativeFrom="page">
               <wp:posOffset>2750823</wp:posOffset>
@@ -2781,10 +2422,10 @@
             <wp:positionV relativeFrom="page">
               <wp:posOffset>2125394</wp:posOffset>
             </wp:positionV>
-            <wp:extent cx="881908" cy="105127"/>
+            <wp:extent cx="877339" cy="100556"/>
             <wp:effectExtent l="0" t="0" r="0" b="0"/>
             <wp:wrapNone/>
-            <wp:docPr id="57" name="Region 57"/>
+            <wp:docPr id="53" name="Region 53"/>
             <wp:cNvGraphicFramePr/>
             <a:graphic xmlns:a="http://schemas.openxmlformats.org/drawingml/2006/main">
               <a:graphicData uri="http://schemas.microsoft.com/office/word/2010/wordprocessingShape">
@@ -2819,22 +2460,22 @@
           </wp:anchor>
         </w:drawing>
       </w:r>
-      <w:bookmarkEnd w:id="57"/>
-      <w:bookmarkStart w:id="58" w:name="p0002_r0017"/>
+      <w:bookmarkEnd w:id="53"/>
+      <w:bookmarkStart w:id="54" w:name="p0002_r0017"/>
       <w:r>
         <w:drawing>
-          <wp:anchor distT="0" distB="0" distL="0" distR="0" simplePos="0" relativeHeight="58" behindDoc="0" locked="0" layoutInCell="1" allowOverlap="1">
+          <wp:anchor distT="0" distB="0" distL="0" distR="0" simplePos="0" relativeHeight="54" behindDoc="0" locked="0" layoutInCell="1" allowOverlap="1">
             <wp:simplePos x="0" y="0"/>
             <wp:positionH relativeFrom="page">
-              <wp:posOffset>3893191</wp:posOffset>
+              <wp:posOffset>3897761</wp:posOffset>
             </wp:positionH>
             <wp:positionV relativeFrom="page">
               <wp:posOffset>2125394</wp:posOffset>
             </wp:positionV>
-            <wp:extent cx="891047" cy="105127"/>
+            <wp:extent cx="886478" cy="100556"/>
             <wp:effectExtent l="0" t="0" r="0" b="0"/>
             <wp:wrapNone/>
-            <wp:docPr id="58" name="Region 58"/>
+            <wp:docPr id="54" name="Region 54"/>
             <wp:cNvGraphicFramePr/>
             <a:graphic xmlns:a="http://schemas.openxmlformats.org/drawingml/2006/main">
               <a:graphicData uri="http://schemas.microsoft.com/office/word/2010/wordprocessingShape">
@@ -2869,11 +2510,11 @@
           </wp:anchor>
         </w:drawing>
       </w:r>
-      <w:bookmarkEnd w:id="58"/>
-      <w:bookmarkStart w:id="59" w:name="p0002_r0018"/>
+      <w:bookmarkEnd w:id="54"/>
+      <w:bookmarkStart w:id="55" w:name="p0002_r0018"/>
       <w:r>
         <w:drawing>
-          <wp:anchor xmlns:a="http://schemas.openxmlformats.org/drawingml/2006/main" xmlns:pic="http://schemas.openxmlformats.org/drawingml/2006/picture" distT="0" distB="0" distL="0" distR="0" simplePos="0" relativeHeight="59" behindDoc="0" locked="0" layoutInCell="1" allowOverlap="1">
+          <wp:anchor xmlns:a="http://schemas.openxmlformats.org/drawingml/2006/main" xmlns:pic="http://schemas.openxmlformats.org/drawingml/2006/picture" distT="0" distB="0" distL="0" distR="0" simplePos="0" relativeHeight="55" behindDoc="0" locked="0" layoutInCell="1" allowOverlap="1">
             <wp:simplePos x="0" y="0"/>
             <wp:positionH relativeFrom="page">
               <wp:posOffset>1553621</wp:posOffset>
@@ -2881,9 +2522,9 @@
             <wp:positionV relativeFrom="page">
               <wp:posOffset>2253375</wp:posOffset>
             </wp:positionV>
-            <wp:extent cx="927603" cy="182829"/>
+            <wp:extent cx="932172" cy="182829"/>
             <wp:wrapNone/>
-            <wp:docPr id="59" name="Picture 59"/>
+            <wp:docPr id="55" name="Picture 55"/>
             <wp:cNvGraphicFramePr>
               <a:graphicFrameLocks noChangeAspect="1"/>
             </wp:cNvGraphicFramePr>
@@ -2895,7 +2536,7 @@
                     <pic:cNvPicPr/>
                   </pic:nvPicPr>
                   <pic:blipFill>
-                    <a:blip r:embed="rId15"/>
+                    <a:blip r:embed="rId11"/>
                     <a:stretch>
                       <a:fillRect/>
                     </a:stretch>
@@ -2903,7 +2544,7 @@
                   <pic:spPr>
                     <a:xfrm>
                       <a:off x="0" y="0"/>
-                      <a:ext cx="927603" cy="182829"/>
+                      <a:ext cx="932172" cy="182829"/>
                     </a:xfrm>
                     <a:prstGeom prst="rect"/>
                   </pic:spPr>
@@ -2913,11 +2554,11 @@
           </wp:anchor>
         </w:drawing>
       </w:r>
-      <w:bookmarkEnd w:id="59"/>
-      <w:bookmarkStart w:id="60" w:name="p0002_r0019"/>
+      <w:bookmarkEnd w:id="55"/>
+      <w:bookmarkStart w:id="56" w:name="p0002_r0019"/>
       <w:r>
         <w:drawing>
-          <wp:anchor xmlns:a="http://schemas.openxmlformats.org/drawingml/2006/main" xmlns:pic="http://schemas.openxmlformats.org/drawingml/2006/picture" distT="0" distB="0" distL="0" distR="0" simplePos="0" relativeHeight="60" behindDoc="0" locked="0" layoutInCell="1" allowOverlap="1">
+          <wp:anchor xmlns:a="http://schemas.openxmlformats.org/drawingml/2006/main" xmlns:pic="http://schemas.openxmlformats.org/drawingml/2006/picture" distT="0" distB="0" distL="0" distR="0" simplePos="0" relativeHeight="56" behindDoc="0" locked="0" layoutInCell="1" allowOverlap="1">
             <wp:simplePos x="0" y="0"/>
             <wp:positionH relativeFrom="page">
               <wp:posOffset>2924463</wp:posOffset>
@@ -2927,7 +2568,7 @@
             </wp:positionV>
             <wp:extent cx="552906" cy="182829"/>
             <wp:wrapNone/>
-            <wp:docPr id="60" name="Picture 60"/>
+            <wp:docPr id="56" name="Picture 56"/>
             <wp:cNvGraphicFramePr>
               <a:graphicFrameLocks noChangeAspect="1"/>
             </wp:cNvGraphicFramePr>
@@ -2939,7 +2580,7 @@
                     <pic:cNvPicPr/>
                   </pic:nvPicPr>
                   <pic:blipFill>
-                    <a:blip r:embed="rId16"/>
+                    <a:blip r:embed="rId12"/>
                     <a:stretch>
                       <a:fillRect/>
                     </a:stretch>
@@ -2957,21 +2598,21 @@
           </wp:anchor>
         </w:drawing>
       </w:r>
-      <w:bookmarkEnd w:id="60"/>
-      <w:bookmarkStart w:id="61" w:name="p0002_r0020"/>
+      <w:bookmarkEnd w:id="56"/>
+      <w:bookmarkStart w:id="57" w:name="p0002_r0020"/>
       <w:r>
         <w:drawing>
-          <wp:anchor xmlns:a="http://schemas.openxmlformats.org/drawingml/2006/main" xmlns:pic="http://schemas.openxmlformats.org/drawingml/2006/picture" distT="0" distB="0" distL="0" distR="0" simplePos="0" relativeHeight="61" behindDoc="0" locked="0" layoutInCell="1" allowOverlap="1">
+          <wp:anchor xmlns:a="http://schemas.openxmlformats.org/drawingml/2006/main" xmlns:pic="http://schemas.openxmlformats.org/drawingml/2006/picture" distT="0" distB="0" distL="0" distR="0" simplePos="0" relativeHeight="57" behindDoc="0" locked="0" layoutInCell="1" allowOverlap="1">
             <wp:simplePos x="0" y="0"/>
             <wp:positionH relativeFrom="page">
-              <wp:posOffset>4167360</wp:posOffset>
+              <wp:posOffset>4171929</wp:posOffset>
             </wp:positionH>
             <wp:positionV relativeFrom="page">
               <wp:posOffset>2253375</wp:posOffset>
             </wp:positionV>
-            <wp:extent cx="365557" cy="182829"/>
+            <wp:extent cx="360988" cy="182829"/>
             <wp:wrapNone/>
-            <wp:docPr id="61" name="Picture 61"/>
+            <wp:docPr id="57" name="Picture 57"/>
             <wp:cNvGraphicFramePr>
               <a:graphicFrameLocks noChangeAspect="1"/>
             </wp:cNvGraphicFramePr>
@@ -2983,7 +2624,7 @@
                     <pic:cNvPicPr/>
                   </pic:nvPicPr>
                   <pic:blipFill>
-                    <a:blip r:embed="rId17"/>
+                    <a:blip r:embed="rId13"/>
                     <a:stretch>
                       <a:fillRect/>
                     </a:stretch>
@@ -2991,7 +2632,7 @@
                   <pic:spPr>
                     <a:xfrm>
                       <a:off x="0" y="0"/>
-                      <a:ext cx="365557" cy="182829"/>
+                      <a:ext cx="360988" cy="182829"/>
                     </a:xfrm>
                     <a:prstGeom prst="rect"/>
                   </pic:spPr>
@@ -3001,170 +2642,17 @@
           </wp:anchor>
         </w:drawing>
       </w:r>
-      <w:bookmarkEnd w:id="61"/>
-      <w:bookmarkStart w:id="62" w:name="p0002_r0021"/>
+      <w:bookmarkEnd w:id="57"/>
+      <w:bookmarkStart w:id="58" w:name="p0002_r0021"/>
+      <w:r/>
+      <w:bookmarkEnd w:id="58"/>
+      <w:bookmarkStart w:id="59" w:name="p0002_r0022"/>
       <w:r>
         <w:drawing>
-          <wp:anchor distT="0" distB="0" distL="0" distR="0" simplePos="0" relativeHeight="62" behindDoc="0" locked="0" layoutInCell="1" allowOverlap="1">
+          <wp:anchor distT="0" distB="0" distL="0" distR="0" simplePos="0" relativeHeight="59" behindDoc="0" locked="0" layoutInCell="1" allowOverlap="1">
             <wp:simplePos x="0" y="0"/>
             <wp:positionH relativeFrom="page">
-              <wp:posOffset>539198</wp:posOffset>
-            </wp:positionH>
-            <wp:positionV relativeFrom="page">
-              <wp:posOffset>2591610</wp:posOffset>
-            </wp:positionV>
-            <wp:extent cx="4245041" cy="9141"/>
-            <wp:effectExtent l="0" t="0" r="0" b="0"/>
-            <wp:wrapNone/>
-            <wp:docPr id="62" name="Region 62"/>
-            <wp:cNvGraphicFramePr/>
-            <a:graphic xmlns:a="http://schemas.openxmlformats.org/drawingml/2006/main">
-              <a:graphicData uri="http://schemas.microsoft.com/office/word/2010/wordprocessingShape">
-                <wps:wsp>
-                  <wps:cNvSpPr/>
-                  <wps:spPr>
-                    <a:xfrm rot="0"/>
-                    <a:prstGeom prst="rect">
-                      <a:avLst/>
-                    </a:prstGeom>
-                    <a:solidFill>
-                      <a:srgbClr val="000000"/>
-                    </a:solidFill>
-                    <a:ln w="12700">
-                      <a:noFill/>
-                    </a:ln>
-                  </wps:spPr>
-                </wps:wsp>
-              </a:graphicData>
-            </a:graphic>
-          </wp:anchor>
-        </w:drawing>
-      </w:r>
-      <w:bookmarkEnd w:id="62"/>
-      <w:bookmarkStart w:id="63" w:name="p0002_r0022"/>
-      <w:r>
-        <w:drawing>
-          <wp:anchor distT="0" distB="0" distL="0" distR="0" simplePos="0" relativeHeight="63" behindDoc="0" locked="0" layoutInCell="1" allowOverlap="1">
-            <wp:simplePos x="0" y="0"/>
-            <wp:positionH relativeFrom="page">
-              <wp:posOffset>539198</wp:posOffset>
-            </wp:positionH>
-            <wp:positionV relativeFrom="page">
-              <wp:posOffset>3784573</wp:posOffset>
-            </wp:positionV>
-            <wp:extent cx="4245041" cy="9141"/>
-            <wp:effectExtent l="0" t="0" r="0" b="0"/>
-            <wp:wrapNone/>
-            <wp:docPr id="63" name="Region 63"/>
-            <wp:cNvGraphicFramePr/>
-            <a:graphic xmlns:a="http://schemas.openxmlformats.org/drawingml/2006/main">
-              <a:graphicData uri="http://schemas.microsoft.com/office/word/2010/wordprocessingShape">
-                <wps:wsp>
-                  <wps:cNvSpPr/>
-                  <wps:spPr>
-                    <a:xfrm rot="0"/>
-                    <a:prstGeom prst="rect">
-                      <a:avLst/>
-                    </a:prstGeom>
-                    <a:solidFill>
-                      <a:srgbClr val="000000"/>
-                    </a:solidFill>
-                    <a:ln w="12700">
-                      <a:noFill/>
-                    </a:ln>
-                  </wps:spPr>
-                </wps:wsp>
-              </a:graphicData>
-            </a:graphic>
-          </wp:anchor>
-        </w:drawing>
-      </w:r>
-      <w:bookmarkEnd w:id="63"/>
-      <w:bookmarkStart w:id="64" w:name="p0002_r0023"/>
-      <w:r>
-        <w:drawing>
-          <wp:anchor distT="0" distB="0" distL="0" distR="0" simplePos="0" relativeHeight="64" behindDoc="0" locked="0" layoutInCell="1" allowOverlap="1">
-            <wp:simplePos x="0" y="0"/>
-            <wp:positionH relativeFrom="page">
-              <wp:posOffset>539198</wp:posOffset>
-            </wp:positionH>
-            <wp:positionV relativeFrom="page">
-              <wp:posOffset>2591610</wp:posOffset>
-            </wp:positionV>
-            <wp:extent cx="9139" cy="1197534"/>
-            <wp:effectExtent l="0" t="0" r="0" b="0"/>
-            <wp:wrapNone/>
-            <wp:docPr id="64" name="Region 64"/>
-            <wp:cNvGraphicFramePr/>
-            <a:graphic xmlns:a="http://schemas.openxmlformats.org/drawingml/2006/main">
-              <a:graphicData uri="http://schemas.microsoft.com/office/word/2010/wordprocessingShape">
-                <wps:wsp>
-                  <wps:cNvSpPr/>
-                  <wps:spPr>
-                    <a:xfrm rot="0"/>
-                    <a:prstGeom prst="rect">
-                      <a:avLst/>
-                    </a:prstGeom>
-                    <a:solidFill>
-                      <a:srgbClr val="000000"/>
-                    </a:solidFill>
-                    <a:ln w="12700">
-                      <a:noFill/>
-                    </a:ln>
-                  </wps:spPr>
-                </wps:wsp>
-              </a:graphicData>
-            </a:graphic>
-          </wp:anchor>
-        </w:drawing>
-      </w:r>
-      <w:bookmarkEnd w:id="64"/>
-      <w:bookmarkStart w:id="65" w:name="p0002_r0024"/>
-      <w:r>
-        <w:drawing>
-          <wp:anchor distT="0" distB="0" distL="0" distR="0" simplePos="0" relativeHeight="65" behindDoc="0" locked="0" layoutInCell="1" allowOverlap="1">
-            <wp:simplePos x="0" y="0"/>
-            <wp:positionH relativeFrom="page">
-              <wp:posOffset>4779669</wp:posOffset>
-            </wp:positionH>
-            <wp:positionV relativeFrom="page">
-              <wp:posOffset>2591610</wp:posOffset>
-            </wp:positionV>
-            <wp:extent cx="9139" cy="1197534"/>
-            <wp:effectExtent l="0" t="0" r="0" b="0"/>
-            <wp:wrapNone/>
-            <wp:docPr id="65" name="Region 65"/>
-            <wp:cNvGraphicFramePr/>
-            <a:graphic xmlns:a="http://schemas.openxmlformats.org/drawingml/2006/main">
-              <a:graphicData uri="http://schemas.microsoft.com/office/word/2010/wordprocessingShape">
-                <wps:wsp>
-                  <wps:cNvSpPr/>
-                  <wps:spPr>
-                    <a:xfrm rot="0"/>
-                    <a:prstGeom prst="rect">
-                      <a:avLst/>
-                    </a:prstGeom>
-                    <a:solidFill>
-                      <a:srgbClr val="000000"/>
-                    </a:solidFill>
-                    <a:ln w="12700">
-                      <a:noFill/>
-                    </a:ln>
-                  </wps:spPr>
-                </wps:wsp>
-              </a:graphicData>
-            </a:graphic>
-          </wp:anchor>
-        </w:drawing>
-      </w:r>
-      <w:bookmarkEnd w:id="65"/>
-      <w:bookmarkStart w:id="66" w:name="p0002_r0025"/>
-      <w:r>
-        <w:drawing>
-          <wp:anchor distT="0" distB="0" distL="0" distR="0" simplePos="0" relativeHeight="66" behindDoc="0" locked="0" layoutInCell="1" allowOverlap="1">
-            <wp:simplePos x="0" y="0"/>
-            <wp:positionH relativeFrom="page">
-              <wp:posOffset>708268</wp:posOffset>
+              <wp:posOffset>712838</wp:posOffset>
             </wp:positionH>
             <wp:positionV relativeFrom="page">
               <wp:posOffset>2705879</wp:posOffset>
@@ -3172,7 +2660,7 @@
             <wp:extent cx="1050979" cy="123410"/>
             <wp:effectExtent l="0" t="0" r="0" b="0"/>
             <wp:wrapNone/>
-            <wp:docPr id="66" name="Region 66"/>
+            <wp:docPr id="59" name="Region 59"/>
             <wp:cNvGraphicFramePr/>
             <a:graphic xmlns:a="http://schemas.openxmlformats.org/drawingml/2006/main">
               <a:graphicData uri="http://schemas.microsoft.com/office/word/2010/wordprocessingShape">
@@ -3207,22 +2695,22 @@
           </wp:anchor>
         </w:drawing>
       </w:r>
-      <w:bookmarkEnd w:id="66"/>
-      <w:bookmarkStart w:id="67" w:name="p0002_r0026"/>
+      <w:bookmarkEnd w:id="59"/>
+      <w:bookmarkStart w:id="60" w:name="p0002_r0023"/>
       <w:r>
         <w:drawing>
-          <wp:anchor distT="0" distB="0" distL="0" distR="0" simplePos="0" relativeHeight="67" behindDoc="0" locked="0" layoutInCell="1" allowOverlap="1">
+          <wp:anchor distT="0" distB="0" distL="0" distR="0" simplePos="0" relativeHeight="60" behindDoc="0" locked="0" layoutInCell="1" allowOverlap="1">
             <wp:simplePos x="0" y="0"/>
             <wp:positionH relativeFrom="page">
-              <wp:posOffset>2755392</wp:posOffset>
+              <wp:posOffset>2759962</wp:posOffset>
             </wp:positionH>
             <wp:positionV relativeFrom="page">
-              <wp:posOffset>2692166</wp:posOffset>
+              <wp:posOffset>2696737</wp:posOffset>
             </wp:positionV>
-            <wp:extent cx="109667" cy="105127"/>
+            <wp:extent cx="105098" cy="105127"/>
             <wp:effectExtent l="0" t="0" r="0" b="0"/>
             <wp:wrapNone/>
-            <wp:docPr id="67" name="Region 67"/>
+            <wp:docPr id="60" name="Region 60"/>
             <wp:cNvGraphicFramePr/>
             <a:graphic xmlns:a="http://schemas.openxmlformats.org/drawingml/2006/main">
               <a:graphicData uri="http://schemas.microsoft.com/office/word/2010/wordprocessingShape">
@@ -3257,22 +2745,22 @@
           </wp:anchor>
         </w:drawing>
       </w:r>
-      <w:bookmarkEnd w:id="67"/>
-      <w:bookmarkStart w:id="68" w:name="p0002_r0027"/>
+      <w:bookmarkEnd w:id="60"/>
+      <w:bookmarkStart w:id="61" w:name="p0002_r0024"/>
       <w:r>
         <w:drawing>
-          <wp:anchor distT="0" distB="0" distL="0" distR="0" simplePos="0" relativeHeight="68" behindDoc="0" locked="0" layoutInCell="1" allowOverlap="1">
+          <wp:anchor distT="0" distB="0" distL="0" distR="0" simplePos="0" relativeHeight="61" behindDoc="0" locked="0" layoutInCell="1" allowOverlap="1">
             <wp:simplePos x="0" y="0"/>
             <wp:positionH relativeFrom="page">
-              <wp:posOffset>2933602</wp:posOffset>
+              <wp:posOffset>2938171</wp:posOffset>
             </wp:positionH>
             <wp:positionV relativeFrom="page">
-              <wp:posOffset>2715020</wp:posOffset>
+              <wp:posOffset>2719591</wp:posOffset>
             </wp:positionV>
-            <wp:extent cx="991576" cy="100556"/>
+            <wp:extent cx="1009854" cy="105127"/>
             <wp:effectExtent l="0" t="0" r="0" b="0"/>
             <wp:wrapNone/>
-            <wp:docPr id="68" name="Region 68"/>
+            <wp:docPr id="61" name="Region 61"/>
             <wp:cNvGraphicFramePr/>
             <a:graphic xmlns:a="http://schemas.openxmlformats.org/drawingml/2006/main">
               <a:graphicData uri="http://schemas.microsoft.com/office/word/2010/wordprocessingShape">
@@ -3307,22 +2795,22 @@
           </wp:anchor>
         </w:drawing>
       </w:r>
-      <w:bookmarkEnd w:id="68"/>
-      <w:bookmarkStart w:id="69" w:name="p0002_r0028"/>
+      <w:bookmarkEnd w:id="61"/>
+      <w:bookmarkStart w:id="62" w:name="p0002_r0025"/>
       <w:r>
         <w:drawing>
-          <wp:anchor distT="0" distB="0" distL="0" distR="0" simplePos="0" relativeHeight="69" behindDoc="0" locked="0" layoutInCell="1" allowOverlap="1">
+          <wp:anchor distT="0" distB="0" distL="0" distR="0" simplePos="0" relativeHeight="62" behindDoc="0" locked="0" layoutInCell="1" allowOverlap="1">
             <wp:simplePos x="0" y="0"/>
             <wp:positionH relativeFrom="page">
-              <wp:posOffset>708268</wp:posOffset>
+              <wp:posOffset>712838</wp:posOffset>
             </wp:positionH>
             <wp:positionV relativeFrom="page">
               <wp:posOffset>2970981</wp:posOffset>
             </wp:positionV>
-            <wp:extent cx="1704414" cy="105127"/>
+            <wp:extent cx="1306869" cy="109698"/>
             <wp:effectExtent l="0" t="0" r="0" b="0"/>
             <wp:wrapNone/>
-            <wp:docPr id="69" name="Region 69"/>
+            <wp:docPr id="62" name="Region 62"/>
             <wp:cNvGraphicFramePr/>
             <a:graphic xmlns:a="http://schemas.openxmlformats.org/drawingml/2006/main">
               <a:graphicData uri="http://schemas.microsoft.com/office/word/2010/wordprocessingShape">
@@ -3345,7 +2833,7 @@
                           <w:rPr>
                             <w:sz w:val="12"/>
                           </w:rPr>
-                          <w:t>Abnormalities to monitor:</w:t>
+                          <w:t>Findings requiring observation:</w:t>
                         </w:r>
                       </w:p>
                     </w:txbxContent>
@@ -3357,19 +2845,303 @@
           </wp:anchor>
         </w:drawing>
       </w:r>
+      <w:bookmarkEnd w:id="62"/>
+      <w:bookmarkStart w:id="63" w:name="p0002_r0026"/>
+      <w:r>
+        <w:drawing>
+          <wp:anchor distT="0" distB="0" distL="0" distR="0" simplePos="0" relativeHeight="63" behindDoc="0" locked="0" layoutInCell="1" allowOverlap="1">
+            <wp:simplePos x="0" y="0"/>
+            <wp:positionH relativeFrom="page">
+              <wp:posOffset>2759962</wp:posOffset>
+            </wp:positionH>
+            <wp:positionV relativeFrom="page">
+              <wp:posOffset>2970981</wp:posOffset>
+            </wp:positionV>
+            <wp:extent cx="1302300" cy="109698"/>
+            <wp:effectExtent l="0" t="0" r="0" b="0"/>
+            <wp:wrapNone/>
+            <wp:docPr id="63" name="Region 63"/>
+            <wp:cNvGraphicFramePr/>
+            <a:graphic xmlns:a="http://schemas.openxmlformats.org/drawingml/2006/main">
+              <a:graphicData uri="http://schemas.microsoft.com/office/word/2010/wordprocessingShape">
+                <wps:wsp>
+                  <wps:cNvSpPr/>
+                  <wps:spPr>
+                    <a:xfrm rot="0"/>
+                    <a:prstGeom prst="rect">
+                      <a:avLst/>
+                    </a:prstGeom>
+                    <a:noFill/>
+                    <a:ln w="12700">
+                      <a:noFill/>
+                    </a:ln>
+                  </wps:spPr>
+                  <wps:txbx>
+                    <w:txbxContent>
+                      <w:p>
+                        <w:r>
+                          <w:rPr>
+                            <w:sz w:val="14"/>
+                          </w:rPr>
+                          <w:t>Further measures agreed:</w:t>
+                        </w:r>
+                      </w:p>
+                    </w:txbxContent>
+                  </wps:txbx>
+                  <wps:bodyPr lIns="0" tIns="0" rIns="0" bIns="0"/>
+                </wps:wsp>
+              </a:graphicData>
+            </a:graphic>
+          </wp:anchor>
+        </w:drawing>
+      </w:r>
+      <w:bookmarkEnd w:id="63"/>
+      <w:bookmarkStart w:id="64" w:name="p0002_r0027"/>
+      <w:r>
+        <w:drawing>
+          <wp:anchor distT="0" distB="0" distL="0" distR="0" simplePos="0" relativeHeight="64" behindDoc="0" locked="0" layoutInCell="1" allowOverlap="1">
+            <wp:simplePos x="0" y="0"/>
+            <wp:positionH relativeFrom="page">
+              <wp:posOffset>708268</wp:posOffset>
+            </wp:positionH>
+            <wp:positionV relativeFrom="page">
+              <wp:posOffset>3103533</wp:posOffset>
+            </wp:positionV>
+            <wp:extent cx="1910040" cy="9141"/>
+            <wp:effectExtent l="0" t="0" r="0" b="0"/>
+            <wp:wrapNone/>
+            <wp:docPr id="64" name="Region 64"/>
+            <wp:cNvGraphicFramePr/>
+            <a:graphic xmlns:a="http://schemas.openxmlformats.org/drawingml/2006/main">
+              <a:graphicData uri="http://schemas.microsoft.com/office/word/2010/wordprocessingShape">
+                <wps:wsp>
+                  <wps:cNvSpPr/>
+                  <wps:spPr>
+                    <a:xfrm rot="0"/>
+                    <a:prstGeom prst="rect">
+                      <a:avLst/>
+                    </a:prstGeom>
+                    <a:solidFill>
+                      <a:srgbClr val="000000"/>
+                    </a:solidFill>
+                    <a:ln w="12700">
+                      <a:noFill/>
+                    </a:ln>
+                  </wps:spPr>
+                </wps:wsp>
+              </a:graphicData>
+            </a:graphic>
+          </wp:anchor>
+        </w:drawing>
+      </w:r>
+      <w:bookmarkEnd w:id="64"/>
+      <w:bookmarkStart w:id="65" w:name="p0002_r0028"/>
+      <w:r>
+        <w:drawing>
+          <wp:anchor distT="0" distB="0" distL="0" distR="0" simplePos="0" relativeHeight="65" behindDoc="0" locked="0" layoutInCell="1" allowOverlap="1">
+            <wp:simplePos x="0" y="0"/>
+            <wp:positionH relativeFrom="page">
+              <wp:posOffset>2759962</wp:posOffset>
+            </wp:positionH>
+            <wp:positionV relativeFrom="page">
+              <wp:posOffset>3103533</wp:posOffset>
+            </wp:positionV>
+            <wp:extent cx="1910040" cy="9141"/>
+            <wp:effectExtent l="0" t="0" r="0" b="0"/>
+            <wp:wrapNone/>
+            <wp:docPr id="65" name="Region 65"/>
+            <wp:cNvGraphicFramePr/>
+            <a:graphic xmlns:a="http://schemas.openxmlformats.org/drawingml/2006/main">
+              <a:graphicData uri="http://schemas.microsoft.com/office/word/2010/wordprocessingShape">
+                <wps:wsp>
+                  <wps:cNvSpPr/>
+                  <wps:spPr>
+                    <a:xfrm rot="0"/>
+                    <a:prstGeom prst="rect">
+                      <a:avLst/>
+                    </a:prstGeom>
+                    <a:solidFill>
+                      <a:srgbClr val="000000"/>
+                    </a:solidFill>
+                    <a:ln w="12700">
+                      <a:noFill/>
+                    </a:ln>
+                  </wps:spPr>
+                </wps:wsp>
+              </a:graphicData>
+            </a:graphic>
+          </wp:anchor>
+        </w:drawing>
+      </w:r>
+      <w:bookmarkEnd w:id="65"/>
+      <w:bookmarkStart w:id="66" w:name="p0002_r0029"/>
+      <w:r>
+        <w:drawing>
+          <wp:anchor distT="0" distB="0" distL="0" distR="0" simplePos="0" relativeHeight="66" behindDoc="0" locked="0" layoutInCell="1" allowOverlap="1">
+            <wp:simplePos x="0" y="0"/>
+            <wp:positionH relativeFrom="page">
+              <wp:posOffset>708268</wp:posOffset>
+            </wp:positionH>
+            <wp:positionV relativeFrom="page">
+              <wp:posOffset>3405202</wp:posOffset>
+            </wp:positionV>
+            <wp:extent cx="1910040" cy="9141"/>
+            <wp:effectExtent l="0" t="0" r="0" b="0"/>
+            <wp:wrapNone/>
+            <wp:docPr id="66" name="Region 66"/>
+            <wp:cNvGraphicFramePr/>
+            <a:graphic xmlns:a="http://schemas.openxmlformats.org/drawingml/2006/main">
+              <a:graphicData uri="http://schemas.microsoft.com/office/word/2010/wordprocessingShape">
+                <wps:wsp>
+                  <wps:cNvSpPr/>
+                  <wps:spPr>
+                    <a:xfrm rot="0"/>
+                    <a:prstGeom prst="rect">
+                      <a:avLst/>
+                    </a:prstGeom>
+                    <a:solidFill>
+                      <a:srgbClr val="000000"/>
+                    </a:solidFill>
+                    <a:ln w="12700">
+                      <a:noFill/>
+                    </a:ln>
+                  </wps:spPr>
+                </wps:wsp>
+              </a:graphicData>
+            </a:graphic>
+          </wp:anchor>
+        </w:drawing>
+      </w:r>
+      <w:bookmarkEnd w:id="66"/>
+      <w:bookmarkStart w:id="67" w:name="p0002_r0030"/>
+      <w:r>
+        <w:drawing>
+          <wp:anchor distT="0" distB="0" distL="0" distR="0" simplePos="0" relativeHeight="67" behindDoc="0" locked="0" layoutInCell="1" allowOverlap="1">
+            <wp:simplePos x="0" y="0"/>
+            <wp:positionH relativeFrom="page">
+              <wp:posOffset>2759962</wp:posOffset>
+            </wp:positionH>
+            <wp:positionV relativeFrom="page">
+              <wp:posOffset>3405202</wp:posOffset>
+            </wp:positionV>
+            <wp:extent cx="1910040" cy="9141"/>
+            <wp:effectExtent l="0" t="0" r="0" b="0"/>
+            <wp:wrapNone/>
+            <wp:docPr id="67" name="Region 67"/>
+            <wp:cNvGraphicFramePr/>
+            <a:graphic xmlns:a="http://schemas.openxmlformats.org/drawingml/2006/main">
+              <a:graphicData uri="http://schemas.microsoft.com/office/word/2010/wordprocessingShape">
+                <wps:wsp>
+                  <wps:cNvSpPr/>
+                  <wps:spPr>
+                    <a:xfrm rot="0"/>
+                    <a:prstGeom prst="rect">
+                      <a:avLst/>
+                    </a:prstGeom>
+                    <a:solidFill>
+                      <a:srgbClr val="000000"/>
+                    </a:solidFill>
+                    <a:ln w="12700">
+                      <a:noFill/>
+                    </a:ln>
+                  </wps:spPr>
+                </wps:wsp>
+              </a:graphicData>
+            </a:graphic>
+          </wp:anchor>
+        </w:drawing>
+      </w:r>
+      <w:bookmarkEnd w:id="67"/>
+      <w:bookmarkStart w:id="68" w:name="p0002_r0031"/>
+      <w:r>
+        <w:drawing>
+          <wp:anchor distT="0" distB="0" distL="0" distR="0" simplePos="0" relativeHeight="68" behindDoc="0" locked="0" layoutInCell="1" allowOverlap="1">
+            <wp:simplePos x="0" y="0"/>
+            <wp:positionH relativeFrom="page">
+              <wp:posOffset>708268</wp:posOffset>
+            </wp:positionH>
+            <wp:positionV relativeFrom="page">
+              <wp:posOffset>3711441</wp:posOffset>
+            </wp:positionV>
+            <wp:extent cx="1910040" cy="9141"/>
+            <wp:effectExtent l="0" t="0" r="0" b="0"/>
+            <wp:wrapNone/>
+            <wp:docPr id="68" name="Region 68"/>
+            <wp:cNvGraphicFramePr/>
+            <a:graphic xmlns:a="http://schemas.openxmlformats.org/drawingml/2006/main">
+              <a:graphicData uri="http://schemas.microsoft.com/office/word/2010/wordprocessingShape">
+                <wps:wsp>
+                  <wps:cNvSpPr/>
+                  <wps:spPr>
+                    <a:xfrm rot="0"/>
+                    <a:prstGeom prst="rect">
+                      <a:avLst/>
+                    </a:prstGeom>
+                    <a:solidFill>
+                      <a:srgbClr val="000000"/>
+                    </a:solidFill>
+                    <a:ln w="12700">
+                      <a:noFill/>
+                    </a:ln>
+                  </wps:spPr>
+                </wps:wsp>
+              </a:graphicData>
+            </a:graphic>
+          </wp:anchor>
+        </w:drawing>
+      </w:r>
+      <w:bookmarkEnd w:id="68"/>
+      <w:bookmarkStart w:id="69" w:name="p0002_r0032"/>
+      <w:r>
+        <w:drawing>
+          <wp:anchor distT="0" distB="0" distL="0" distR="0" simplePos="0" relativeHeight="69" behindDoc="0" locked="0" layoutInCell="1" allowOverlap="1">
+            <wp:simplePos x="0" y="0"/>
+            <wp:positionH relativeFrom="page">
+              <wp:posOffset>2759962</wp:posOffset>
+            </wp:positionH>
+            <wp:positionV relativeFrom="page">
+              <wp:posOffset>3711441</wp:posOffset>
+            </wp:positionV>
+            <wp:extent cx="1910040" cy="9141"/>
+            <wp:effectExtent l="0" t="0" r="0" b="0"/>
+            <wp:wrapNone/>
+            <wp:docPr id="69" name="Region 69"/>
+            <wp:cNvGraphicFramePr/>
+            <a:graphic xmlns:a="http://schemas.openxmlformats.org/drawingml/2006/main">
+              <a:graphicData uri="http://schemas.microsoft.com/office/word/2010/wordprocessingShape">
+                <wps:wsp>
+                  <wps:cNvSpPr/>
+                  <wps:spPr>
+                    <a:xfrm rot="0"/>
+                    <a:prstGeom prst="rect">
+                      <a:avLst/>
+                    </a:prstGeom>
+                    <a:solidFill>
+                      <a:srgbClr val="000000"/>
+                    </a:solidFill>
+                    <a:ln w="12700">
+                      <a:noFill/>
+                    </a:ln>
+                  </wps:spPr>
+                </wps:wsp>
+              </a:graphicData>
+            </a:graphic>
+          </wp:anchor>
+        </w:drawing>
+      </w:r>
       <w:bookmarkEnd w:id="69"/>
-      <w:bookmarkStart w:id="70" w:name="p0002_r0029"/>
+      <w:bookmarkStart w:id="70" w:name="p0002_r0033"/>
       <w:r>
         <w:drawing>
           <wp:anchor distT="0" distB="0" distL="0" distR="0" simplePos="0" relativeHeight="70" behindDoc="0" locked="0" layoutInCell="1" allowOverlap="1">
             <wp:simplePos x="0" y="0"/>
             <wp:positionH relativeFrom="page">
-              <wp:posOffset>2755392</wp:posOffset>
+              <wp:posOffset>534628</wp:posOffset>
             </wp:positionH>
             <wp:positionV relativeFrom="page">
-              <wp:posOffset>2970981</wp:posOffset>
+              <wp:posOffset>3967403</wp:posOffset>
             </wp:positionV>
-            <wp:extent cx="1402828" cy="105127"/>
+            <wp:extent cx="3705843" cy="109698"/>
             <wp:effectExtent l="0" t="0" r="0" b="0"/>
             <wp:wrapNone/>
             <wp:docPr id="70" name="Region 70"/>
@@ -3393,9 +3165,9 @@
                       <w:p>
                         <w:r>
                           <w:rPr>
-                            <w:sz w:val="12"/>
+                            <w:sz w:val="14"/>
                           </w:rPr>
-                          <w:t>Further measures agreed:</w:t>
+                          <w:t>Examination, counselling and, if necessary, arranging:</w:t>
                         </w:r>
                       </w:p>
                     </w:txbxContent>
@@ -3408,18 +3180,18 @@
         </w:drawing>
       </w:r>
       <w:bookmarkEnd w:id="70"/>
-      <w:bookmarkStart w:id="71" w:name="p0002_r0030"/>
+      <w:bookmarkStart w:id="71" w:name="p0002_r0034"/>
       <w:r>
         <w:drawing>
           <wp:anchor distT="0" distB="0" distL="0" distR="0" simplePos="0" relativeHeight="71" behindDoc="0" locked="0" layoutInCell="1" allowOverlap="1">
             <wp:simplePos x="0" y="0"/>
             <wp:positionH relativeFrom="page">
-              <wp:posOffset>708268</wp:posOffset>
+              <wp:posOffset>534628</wp:posOffset>
             </wp:positionH>
             <wp:positionV relativeFrom="page">
-              <wp:posOffset>3103533</wp:posOffset>
+              <wp:posOffset>4113667</wp:posOffset>
             </wp:positionV>
-            <wp:extent cx="1905470" cy="9141"/>
+            <wp:extent cx="4249610" cy="9141"/>
             <wp:effectExtent l="0" t="0" r="0" b="0"/>
             <wp:wrapNone/>
             <wp:docPr id="71" name="Region 71"/>
@@ -3447,216 +3219,21 @@
         </w:drawing>
       </w:r>
       <w:bookmarkEnd w:id="71"/>
-      <w:bookmarkStart w:id="72" w:name="p0002_r0031"/>
+      <w:bookmarkStart w:id="72" w:name="p0002_r0035"/>
       <w:r>
         <w:drawing>
           <wp:anchor distT="0" distB="0" distL="0" distR="0" simplePos="0" relativeHeight="72" behindDoc="0" locked="0" layoutInCell="1" allowOverlap="1">
             <wp:simplePos x="0" y="0"/>
             <wp:positionH relativeFrom="page">
-              <wp:posOffset>2755392</wp:posOffset>
+              <wp:posOffset>534628</wp:posOffset>
             </wp:positionH>
             <wp:positionV relativeFrom="page">
-              <wp:posOffset>3103533</wp:posOffset>
+              <wp:posOffset>4195940</wp:posOffset>
             </wp:positionV>
-            <wp:extent cx="1905470" cy="9141"/>
+            <wp:extent cx="1562760" cy="242249"/>
             <wp:effectExtent l="0" t="0" r="0" b="0"/>
             <wp:wrapNone/>
             <wp:docPr id="72" name="Region 72"/>
-            <wp:cNvGraphicFramePr/>
-            <a:graphic xmlns:a="http://schemas.openxmlformats.org/drawingml/2006/main">
-              <a:graphicData uri="http://schemas.microsoft.com/office/word/2010/wordprocessingShape">
-                <wps:wsp>
-                  <wps:cNvSpPr/>
-                  <wps:spPr>
-                    <a:xfrm rot="0"/>
-                    <a:prstGeom prst="rect">
-                      <a:avLst/>
-                    </a:prstGeom>
-                    <a:solidFill>
-                      <a:srgbClr val="000000"/>
-                    </a:solidFill>
-                    <a:ln w="12700">
-                      <a:noFill/>
-                    </a:ln>
-                  </wps:spPr>
-                </wps:wsp>
-              </a:graphicData>
-            </a:graphic>
-          </wp:anchor>
-        </w:drawing>
-      </w:r>
-      <w:bookmarkEnd w:id="72"/>
-      <w:bookmarkStart w:id="73" w:name="p0002_r0032"/>
-      <w:r>
-        <w:drawing>
-          <wp:anchor distT="0" distB="0" distL="0" distR="0" simplePos="0" relativeHeight="73" behindDoc="0" locked="0" layoutInCell="1" allowOverlap="1">
-            <wp:simplePos x="0" y="0"/>
-            <wp:positionH relativeFrom="page">
-              <wp:posOffset>708268</wp:posOffset>
-            </wp:positionH>
-            <wp:positionV relativeFrom="page">
-              <wp:posOffset>3405202</wp:posOffset>
-            </wp:positionV>
-            <wp:extent cx="1905470" cy="9141"/>
-            <wp:effectExtent l="0" t="0" r="0" b="0"/>
-            <wp:wrapNone/>
-            <wp:docPr id="73" name="Region 73"/>
-            <wp:cNvGraphicFramePr/>
-            <a:graphic xmlns:a="http://schemas.openxmlformats.org/drawingml/2006/main">
-              <a:graphicData uri="http://schemas.microsoft.com/office/word/2010/wordprocessingShape">
-                <wps:wsp>
-                  <wps:cNvSpPr/>
-                  <wps:spPr>
-                    <a:xfrm rot="0"/>
-                    <a:prstGeom prst="rect">
-                      <a:avLst/>
-                    </a:prstGeom>
-                    <a:solidFill>
-                      <a:srgbClr val="000000"/>
-                    </a:solidFill>
-                    <a:ln w="12700">
-                      <a:noFill/>
-                    </a:ln>
-                  </wps:spPr>
-                </wps:wsp>
-              </a:graphicData>
-            </a:graphic>
-          </wp:anchor>
-        </w:drawing>
-      </w:r>
-      <w:bookmarkEnd w:id="73"/>
-      <w:bookmarkStart w:id="74" w:name="p0002_r0033"/>
-      <w:r>
-        <w:drawing>
-          <wp:anchor distT="0" distB="0" distL="0" distR="0" simplePos="0" relativeHeight="74" behindDoc="0" locked="0" layoutInCell="1" allowOverlap="1">
-            <wp:simplePos x="0" y="0"/>
-            <wp:positionH relativeFrom="page">
-              <wp:posOffset>2755392</wp:posOffset>
-            </wp:positionH>
-            <wp:positionV relativeFrom="page">
-              <wp:posOffset>3405202</wp:posOffset>
-            </wp:positionV>
-            <wp:extent cx="1905470" cy="9141"/>
-            <wp:effectExtent l="0" t="0" r="0" b="0"/>
-            <wp:wrapNone/>
-            <wp:docPr id="74" name="Region 74"/>
-            <wp:cNvGraphicFramePr/>
-            <a:graphic xmlns:a="http://schemas.openxmlformats.org/drawingml/2006/main">
-              <a:graphicData uri="http://schemas.microsoft.com/office/word/2010/wordprocessingShape">
-                <wps:wsp>
-                  <wps:cNvSpPr/>
-                  <wps:spPr>
-                    <a:xfrm rot="0"/>
-                    <a:prstGeom prst="rect">
-                      <a:avLst/>
-                    </a:prstGeom>
-                    <a:solidFill>
-                      <a:srgbClr val="000000"/>
-                    </a:solidFill>
-                    <a:ln w="12700">
-                      <a:noFill/>
-                    </a:ln>
-                  </wps:spPr>
-                </wps:wsp>
-              </a:graphicData>
-            </a:graphic>
-          </wp:anchor>
-        </w:drawing>
-      </w:r>
-      <w:bookmarkEnd w:id="74"/>
-      <w:bookmarkStart w:id="75" w:name="p0002_r0034"/>
-      <w:r>
-        <w:drawing>
-          <wp:anchor distT="0" distB="0" distL="0" distR="0" simplePos="0" relativeHeight="75" behindDoc="0" locked="0" layoutInCell="1" allowOverlap="1">
-            <wp:simplePos x="0" y="0"/>
-            <wp:positionH relativeFrom="page">
-              <wp:posOffset>708268</wp:posOffset>
-            </wp:positionH>
-            <wp:positionV relativeFrom="page">
-              <wp:posOffset>3711441</wp:posOffset>
-            </wp:positionV>
-            <wp:extent cx="1905470" cy="9141"/>
-            <wp:effectExtent l="0" t="0" r="0" b="0"/>
-            <wp:wrapNone/>
-            <wp:docPr id="75" name="Region 75"/>
-            <wp:cNvGraphicFramePr/>
-            <a:graphic xmlns:a="http://schemas.openxmlformats.org/drawingml/2006/main">
-              <a:graphicData uri="http://schemas.microsoft.com/office/word/2010/wordprocessingShape">
-                <wps:wsp>
-                  <wps:cNvSpPr/>
-                  <wps:spPr>
-                    <a:xfrm rot="0"/>
-                    <a:prstGeom prst="rect">
-                      <a:avLst/>
-                    </a:prstGeom>
-                    <a:solidFill>
-                      <a:srgbClr val="000000"/>
-                    </a:solidFill>
-                    <a:ln w="12700">
-                      <a:noFill/>
-                    </a:ln>
-                  </wps:spPr>
-                </wps:wsp>
-              </a:graphicData>
-            </a:graphic>
-          </wp:anchor>
-        </w:drawing>
-      </w:r>
-      <w:bookmarkEnd w:id="75"/>
-      <w:bookmarkStart w:id="76" w:name="p0002_r0035"/>
-      <w:r>
-        <w:drawing>
-          <wp:anchor distT="0" distB="0" distL="0" distR="0" simplePos="0" relativeHeight="76" behindDoc="0" locked="0" layoutInCell="1" allowOverlap="1">
-            <wp:simplePos x="0" y="0"/>
-            <wp:positionH relativeFrom="page">
-              <wp:posOffset>2755392</wp:posOffset>
-            </wp:positionH>
-            <wp:positionV relativeFrom="page">
-              <wp:posOffset>3711441</wp:posOffset>
-            </wp:positionV>
-            <wp:extent cx="1905470" cy="9141"/>
-            <wp:effectExtent l="0" t="0" r="0" b="0"/>
-            <wp:wrapNone/>
-            <wp:docPr id="76" name="Region 76"/>
-            <wp:cNvGraphicFramePr/>
-            <a:graphic xmlns:a="http://schemas.openxmlformats.org/drawingml/2006/main">
-              <a:graphicData uri="http://schemas.microsoft.com/office/word/2010/wordprocessingShape">
-                <wps:wsp>
-                  <wps:cNvSpPr/>
-                  <wps:spPr>
-                    <a:xfrm rot="0"/>
-                    <a:prstGeom prst="rect">
-                      <a:avLst/>
-                    </a:prstGeom>
-                    <a:solidFill>
-                      <a:srgbClr val="000000"/>
-                    </a:solidFill>
-                    <a:ln w="12700">
-                      <a:noFill/>
-                    </a:ln>
-                  </wps:spPr>
-                </wps:wsp>
-              </a:graphicData>
-            </a:graphic>
-          </wp:anchor>
-        </w:drawing>
-      </w:r>
-      <w:bookmarkEnd w:id="76"/>
-      <w:bookmarkStart w:id="77" w:name="p0002_r0036"/>
-      <w:r>
-        <w:drawing>
-          <wp:anchor distT="0" distB="0" distL="0" distR="0" simplePos="0" relativeHeight="77" behindDoc="0" locked="0" layoutInCell="1" allowOverlap="1">
-            <wp:simplePos x="0" y="0"/>
-            <wp:positionH relativeFrom="page">
-              <wp:posOffset>534628</wp:posOffset>
-            </wp:positionH>
-            <wp:positionV relativeFrom="page">
-              <wp:posOffset>3962832</wp:posOffset>
-            </wp:positionV>
-            <wp:extent cx="3687565" cy="114269"/>
-            <wp:effectExtent l="0" t="0" r="0" b="0"/>
-            <wp:wrapNone/>
-            <wp:docPr id="77" name="Region 77"/>
             <wp:cNvGraphicFramePr/>
             <a:graphic xmlns:a="http://schemas.openxmlformats.org/drawingml/2006/main">
               <a:graphicData uri="http://schemas.microsoft.com/office/word/2010/wordprocessingShape">
@@ -3677,9 +3254,10 @@
                       <w:p>
                         <w:r>
                           <w:rPr>
-                            <w:sz w:val="14"/>
+                            <w:sz w:val="10"/>
                           </w:rPr>
-                          <w:t>Examination, counseling and, if necessary, arranging:</w:t>
+                          <w:t>• Newborn hearing screening
+• Screening for hip dysplasia and dislocation</w:t>
                         </w:r>
                       </w:p>
                     </w:txbxContent>
@@ -3691,150 +3269,11 @@
           </wp:anchor>
         </w:drawing>
       </w:r>
-      <w:bookmarkEnd w:id="77"/>
-      <w:bookmarkStart w:id="78" w:name="p0002_r0037"/>
+      <w:bookmarkEnd w:id="72"/>
+      <w:bookmarkStart w:id="73" w:name="p0002_r0036"/>
       <w:r>
         <w:drawing>
-          <wp:anchor distT="0" distB="0" distL="0" distR="0" simplePos="0" relativeHeight="78" behindDoc="0" locked="0" layoutInCell="1" allowOverlap="1">
-            <wp:simplePos x="0" y="0"/>
-            <wp:positionH relativeFrom="page">
-              <wp:posOffset>534628</wp:posOffset>
-            </wp:positionH>
-            <wp:positionV relativeFrom="page">
-              <wp:posOffset>4113667</wp:posOffset>
-            </wp:positionV>
-            <wp:extent cx="4254180" cy="9141"/>
-            <wp:effectExtent l="0" t="0" r="0" b="0"/>
-            <wp:wrapNone/>
-            <wp:docPr id="78" name="Region 78"/>
-            <wp:cNvGraphicFramePr/>
-            <a:graphic xmlns:a="http://schemas.openxmlformats.org/drawingml/2006/main">
-              <a:graphicData uri="http://schemas.microsoft.com/office/word/2010/wordprocessingShape">
-                <wps:wsp>
-                  <wps:cNvSpPr/>
-                  <wps:spPr>
-                    <a:xfrm rot="0"/>
-                    <a:prstGeom prst="rect">
-                      <a:avLst/>
-                    </a:prstGeom>
-                    <a:solidFill>
-                      <a:srgbClr val="000000"/>
-                    </a:solidFill>
-                    <a:ln w="12700">
-                      <a:noFill/>
-                    </a:ln>
-                  </wps:spPr>
-                </wps:wsp>
-              </a:graphicData>
-            </a:graphic>
-          </wp:anchor>
-        </w:drawing>
-      </w:r>
-      <w:bookmarkEnd w:id="78"/>
-      <w:bookmarkStart w:id="79" w:name="p0002_r0038"/>
-      <w:r>
-        <w:drawing>
-          <wp:anchor distT="0" distB="0" distL="0" distR="0" simplePos="0" relativeHeight="79" behindDoc="0" locked="0" layoutInCell="1" allowOverlap="1">
-            <wp:simplePos x="0" y="0"/>
-            <wp:positionH relativeFrom="page">
-              <wp:posOffset>534628</wp:posOffset>
-            </wp:positionH>
-            <wp:positionV relativeFrom="page">
-              <wp:posOffset>4191369</wp:posOffset>
-            </wp:positionV>
-            <wp:extent cx="1553621" cy="109698"/>
-            <wp:effectExtent l="0" t="0" r="0" b="0"/>
-            <wp:wrapNone/>
-            <wp:docPr id="79" name="Region 79"/>
-            <wp:cNvGraphicFramePr/>
-            <a:graphic xmlns:a="http://schemas.openxmlformats.org/drawingml/2006/main">
-              <a:graphicData uri="http://schemas.microsoft.com/office/word/2010/wordprocessingShape">
-                <wps:wsp>
-                  <wps:cNvSpPr/>
-                  <wps:spPr>
-                    <a:xfrm rot="0"/>
-                    <a:prstGeom prst="rect">
-                      <a:avLst/>
-                    </a:prstGeom>
-                    <a:noFill/>
-                    <a:ln w="12700">
-                      <a:noFill/>
-                    </a:ln>
-                  </wps:spPr>
-                  <wps:txbx>
-                    <w:txbxContent>
-                      <w:p>
-                        <w:r>
-                          <w:rPr>
-                            <w:sz w:val="14"/>
-                          </w:rPr>
-                          <w:t>• Newborn hearing screening</w:t>
-                        </w:r>
-                      </w:p>
-                    </w:txbxContent>
-                  </wps:txbx>
-                  <wps:bodyPr lIns="0" tIns="0" rIns="0" bIns="0"/>
-                </wps:wsp>
-              </a:graphicData>
-            </a:graphic>
-          </wp:anchor>
-        </w:drawing>
-      </w:r>
-      <w:bookmarkEnd w:id="79"/>
-      <w:bookmarkStart w:id="80" w:name="p0002_r0039"/>
-      <w:r>
-        <w:drawing>
-          <wp:anchor distT="0" distB="0" distL="0" distR="0" simplePos="0" relativeHeight="80" behindDoc="0" locked="0" layoutInCell="1" allowOverlap="1">
-            <wp:simplePos x="0" y="0"/>
-            <wp:positionH relativeFrom="page">
-              <wp:posOffset>534628</wp:posOffset>
-            </wp:positionH>
-            <wp:positionV relativeFrom="page">
-              <wp:posOffset>4342204</wp:posOffset>
-            </wp:positionV>
-            <wp:extent cx="2554336" cy="109698"/>
-            <wp:effectExtent l="0" t="0" r="0" b="0"/>
-            <wp:wrapNone/>
-            <wp:docPr id="80" name="Region 80"/>
-            <wp:cNvGraphicFramePr/>
-            <a:graphic xmlns:a="http://schemas.openxmlformats.org/drawingml/2006/main">
-              <a:graphicData uri="http://schemas.microsoft.com/office/word/2010/wordprocessingShape">
-                <wps:wsp>
-                  <wps:cNvSpPr/>
-                  <wps:spPr>
-                    <a:xfrm rot="0"/>
-                    <a:prstGeom prst="rect">
-                      <a:avLst/>
-                    </a:prstGeom>
-                    <a:noFill/>
-                    <a:ln w="12700">
-                      <a:noFill/>
-                    </a:ln>
-                  </wps:spPr>
-                  <wps:txbx>
-                    <w:txbxContent>
-                      <w:p>
-                        <w:r>
-                          <w:rPr>
-                            <w:sz w:val="14"/>
-                          </w:rPr>
-                          <w:t>• Screening for hip dysplasia and dislocation</w:t>
-                        </w:r>
-                      </w:p>
-                    </w:txbxContent>
-                  </wps:txbx>
-                  <wps:bodyPr lIns="0" tIns="0" rIns="0" bIns="0"/>
-                </wps:wsp>
-              </a:graphicData>
-            </a:graphic>
-          </wp:anchor>
-        </w:drawing>
-      </w:r>
-      <w:bookmarkEnd w:id="80"/>
-      <w:bookmarkStart w:id="81" w:name="p0002_r0040"/>
-      <w:r>
-        <w:drawing>
-          <wp:anchor distT="0" distB="0" distL="0" distR="0" simplePos="0" relativeHeight="81" behindDoc="0" locked="0" layoutInCell="1" allowOverlap="1">
+          <wp:anchor distT="0" distB="0" distL="0" distR="0" simplePos="0" relativeHeight="73" behindDoc="0" locked="0" layoutInCell="1" allowOverlap="1">
             <wp:simplePos x="0" y="0"/>
             <wp:positionH relativeFrom="page">
               <wp:posOffset>534628</wp:posOffset>
@@ -3842,10 +3281,10 @@
             <wp:positionV relativeFrom="page">
               <wp:posOffset>4621019</wp:posOffset>
             </wp:positionV>
-            <wp:extent cx="2389835" cy="109698"/>
+            <wp:extent cx="2394404" cy="109698"/>
             <wp:effectExtent l="0" t="0" r="0" b="0"/>
             <wp:wrapNone/>
-            <wp:docPr id="81" name="Region 81"/>
+            <wp:docPr id="73" name="Region 73"/>
             <wp:cNvGraphicFramePr/>
             <a:graphic xmlns:a="http://schemas.openxmlformats.org/drawingml/2006/main">
               <a:graphicData uri="http://schemas.microsoft.com/office/word/2010/wordprocessingShape">
@@ -3880,22 +3319,22 @@
           </wp:anchor>
         </w:drawing>
       </w:r>
-      <w:bookmarkEnd w:id="81"/>
-      <w:bookmarkStart w:id="82" w:name="p0002_r0041"/>
+      <w:bookmarkEnd w:id="73"/>
+      <w:bookmarkStart w:id="74" w:name="p0002_r0037"/>
       <w:r>
         <w:drawing>
-          <wp:anchor distT="0" distB="0" distL="0" distR="0" simplePos="0" relativeHeight="82" behindDoc="0" locked="0" layoutInCell="1" allowOverlap="1">
+          <wp:anchor distT="0" distB="0" distL="0" distR="0" simplePos="0" relativeHeight="74" behindDoc="0" locked="0" layoutInCell="1" allowOverlap="1">
             <wp:simplePos x="0" y="0"/>
             <wp:positionH relativeFrom="page">
-              <wp:posOffset>2979297</wp:posOffset>
+              <wp:posOffset>2983866</wp:posOffset>
             </wp:positionH>
             <wp:positionV relativeFrom="page">
               <wp:posOffset>4598165</wp:posOffset>
             </wp:positionV>
-            <wp:extent cx="109667" cy="105127"/>
+            <wp:extent cx="105098" cy="105127"/>
             <wp:effectExtent l="0" t="0" r="0" b="0"/>
             <wp:wrapNone/>
-            <wp:docPr id="82" name="Region 82"/>
+            <wp:docPr id="74" name="Region 74"/>
             <wp:cNvGraphicFramePr/>
             <a:graphic xmlns:a="http://schemas.openxmlformats.org/drawingml/2006/main">
               <a:graphicData uri="http://schemas.microsoft.com/office/word/2010/wordprocessingShape">
@@ -3930,22 +3369,22 @@
           </wp:anchor>
         </w:drawing>
       </w:r>
-      <w:bookmarkEnd w:id="82"/>
-      <w:bookmarkStart w:id="83" w:name="p0002_r0042"/>
+      <w:bookmarkEnd w:id="74"/>
+      <w:bookmarkStart w:id="75" w:name="p0002_r0038"/>
       <w:r>
         <w:drawing>
-          <wp:anchor distT="0" distB="0" distL="0" distR="0" simplePos="0" relativeHeight="83" behindDoc="0" locked="0" layoutInCell="1" allowOverlap="1">
+          <wp:anchor distT="0" distB="0" distL="0" distR="0" simplePos="0" relativeHeight="75" behindDoc="0" locked="0" layoutInCell="1" allowOverlap="1">
             <wp:simplePos x="0" y="0"/>
             <wp:positionH relativeFrom="page">
-              <wp:posOffset>3134659</wp:posOffset>
+              <wp:posOffset>3139228</wp:posOffset>
             </wp:positionH>
             <wp:positionV relativeFrom="page">
               <wp:posOffset>4621019</wp:posOffset>
             </wp:positionV>
-            <wp:extent cx="105098" cy="100556"/>
+            <wp:extent cx="100528" cy="100556"/>
             <wp:effectExtent l="0" t="0" r="0" b="0"/>
             <wp:wrapNone/>
-            <wp:docPr id="83" name="Region 83"/>
+            <wp:docPr id="75" name="Region 75"/>
             <wp:cNvGraphicFramePr/>
             <a:graphic xmlns:a="http://schemas.openxmlformats.org/drawingml/2006/main">
               <a:graphicData uri="http://schemas.microsoft.com/office/word/2010/wordprocessingShape">
@@ -3980,11 +3419,11 @@
           </wp:anchor>
         </w:drawing>
       </w:r>
-      <w:bookmarkEnd w:id="83"/>
-      <w:bookmarkStart w:id="84" w:name="p0002_r0043"/>
+      <w:bookmarkEnd w:id="75"/>
+      <w:bookmarkStart w:id="76" w:name="p0002_r0039"/>
       <w:r>
         <w:drawing>
-          <wp:anchor distT="0" distB="0" distL="0" distR="0" simplePos="0" relativeHeight="84" behindDoc="0" locked="0" layoutInCell="1" allowOverlap="1">
+          <wp:anchor distT="0" distB="0" distL="0" distR="0" simplePos="0" relativeHeight="76" behindDoc="0" locked="0" layoutInCell="1" allowOverlap="1">
             <wp:simplePos x="0" y="0"/>
             <wp:positionH relativeFrom="page">
               <wp:posOffset>3326577</wp:posOffset>
@@ -3992,10 +3431,10 @@
             <wp:positionV relativeFrom="page">
               <wp:posOffset>4598165</wp:posOffset>
             </wp:positionV>
-            <wp:extent cx="109667" cy="105127"/>
+            <wp:extent cx="105098" cy="105127"/>
             <wp:effectExtent l="0" t="0" r="0" b="0"/>
             <wp:wrapNone/>
-            <wp:docPr id="84" name="Region 84"/>
+            <wp:docPr id="76" name="Region 76"/>
             <wp:cNvGraphicFramePr/>
             <a:graphic xmlns:a="http://schemas.openxmlformats.org/drawingml/2006/main">
               <a:graphicData uri="http://schemas.microsoft.com/office/word/2010/wordprocessingShape">
@@ -4030,11 +3469,11 @@
           </wp:anchor>
         </w:drawing>
       </w:r>
-      <w:bookmarkEnd w:id="84"/>
-      <w:bookmarkStart w:id="85" w:name="p0002_r0044"/>
+      <w:bookmarkEnd w:id="76"/>
+      <w:bookmarkStart w:id="77" w:name="p0002_r0040"/>
       <w:r>
         <w:drawing>
-          <wp:anchor distT="0" distB="0" distL="0" distR="0" simplePos="0" relativeHeight="85" behindDoc="0" locked="0" layoutInCell="1" allowOverlap="1">
+          <wp:anchor distT="0" distB="0" distL="0" distR="0" simplePos="0" relativeHeight="77" behindDoc="0" locked="0" layoutInCell="1" allowOverlap="1">
             <wp:simplePos x="0" y="0"/>
             <wp:positionH relativeFrom="page">
               <wp:posOffset>3481939</wp:posOffset>
@@ -4045,7 +3484,7 @@
             <wp:extent cx="205626" cy="100556"/>
             <wp:effectExtent l="0" t="0" r="0" b="0"/>
             <wp:wrapNone/>
-            <wp:docPr id="85" name="Region 85"/>
+            <wp:docPr id="77" name="Region 77"/>
             <wp:cNvGraphicFramePr/>
             <a:graphic xmlns:a="http://schemas.openxmlformats.org/drawingml/2006/main">
               <a:graphicData uri="http://schemas.microsoft.com/office/word/2010/wordprocessingShape">
@@ -4080,19 +3519,333 @@
           </wp:anchor>
         </w:drawing>
       </w:r>
+      <w:bookmarkEnd w:id="77"/>
+      <w:bookmarkStart w:id="78" w:name="p0002_r0041"/>
+      <w:r>
+        <w:drawing>
+          <wp:anchor distT="0" distB="0" distL="0" distR="0" simplePos="0" relativeHeight="78" behindDoc="0" locked="0" layoutInCell="1" allowOverlap="1">
+            <wp:simplePos x="0" y="0"/>
+            <wp:positionH relativeFrom="page">
+              <wp:posOffset>534628</wp:posOffset>
+            </wp:positionH>
+            <wp:positionV relativeFrom="page">
+              <wp:posOffset>4831273</wp:posOffset>
+            </wp:positionV>
+            <wp:extent cx="1018993" cy="105127"/>
+            <wp:effectExtent l="0" t="0" r="0" b="0"/>
+            <wp:wrapNone/>
+            <wp:docPr id="78" name="Region 78"/>
+            <wp:cNvGraphicFramePr/>
+            <a:graphic xmlns:a="http://schemas.openxmlformats.org/drawingml/2006/main">
+              <a:graphicData uri="http://schemas.microsoft.com/office/word/2010/wordprocessingShape">
+                <wps:wsp>
+                  <wps:cNvSpPr/>
+                  <wps:spPr>
+                    <a:xfrm rot="0"/>
+                    <a:prstGeom prst="rect">
+                      <a:avLst/>
+                    </a:prstGeom>
+                    <a:noFill/>
+                    <a:ln w="12700">
+                      <a:noFill/>
+                    </a:ln>
+                  </wps:spPr>
+                  <wps:txbx>
+                    <w:txbxContent>
+                      <w:p>
+                        <w:r>
+                          <w:rPr>
+                            <w:sz w:val="12"/>
+                          </w:rPr>
+                          <w:t>missing vaccinations:</w:t>
+                        </w:r>
+                      </w:p>
+                    </w:txbxContent>
+                  </wps:txbx>
+                  <wps:bodyPr lIns="0" tIns="0" rIns="0" bIns="0"/>
+                </wps:wsp>
+              </a:graphicData>
+            </a:graphic>
+          </wp:anchor>
+        </w:drawing>
+      </w:r>
+      <w:bookmarkEnd w:id="78"/>
+      <w:bookmarkStart w:id="79" w:name="p0002_r0042"/>
+      <w:r>
+        <w:drawing>
+          <wp:anchor xmlns:a="http://schemas.openxmlformats.org/drawingml/2006/main" xmlns:pic="http://schemas.openxmlformats.org/drawingml/2006/picture" distT="0" distB="0" distL="0" distR="0" simplePos="0" relativeHeight="79" behindDoc="0" locked="0" layoutInCell="1" allowOverlap="1">
+            <wp:simplePos x="0" y="0"/>
+            <wp:positionH relativeFrom="page">
+              <wp:posOffset>1599316</wp:posOffset>
+            </wp:positionH>
+            <wp:positionV relativeFrom="page">
+              <wp:posOffset>4771853</wp:posOffset>
+            </wp:positionV>
+            <wp:extent cx="3184922" cy="182829"/>
+            <wp:wrapNone/>
+            <wp:docPr id="79" name="Picture 79"/>
+            <wp:cNvGraphicFramePr>
+              <a:graphicFrameLocks noChangeAspect="1"/>
+            </wp:cNvGraphicFramePr>
+            <a:graphic>
+              <a:graphicData uri="http://schemas.openxmlformats.org/drawingml/2006/picture">
+                <pic:pic>
+                  <pic:nvPicPr>
+                    <pic:cNvPr id="0" name="image.png"/>
+                    <pic:cNvPicPr/>
+                  </pic:nvPicPr>
+                  <pic:blipFill>
+                    <a:blip r:embed="rId14"/>
+                    <a:stretch>
+                      <a:fillRect/>
+                    </a:stretch>
+                  </pic:blipFill>
+                  <pic:spPr>
+                    <a:xfrm>
+                      <a:off x="0" y="0"/>
+                      <a:ext cx="3184922" cy="182829"/>
+                    </a:xfrm>
+                    <a:prstGeom prst="rect"/>
+                  </pic:spPr>
+                </pic:pic>
+              </a:graphicData>
+            </a:graphic>
+          </wp:anchor>
+        </w:drawing>
+      </w:r>
+      <w:bookmarkEnd w:id="79"/>
+      <w:bookmarkStart w:id="80" w:name="p0002_r0043"/>
+      <w:r>
+        <w:drawing>
+          <wp:anchor distT="0" distB="0" distL="0" distR="0" simplePos="0" relativeHeight="80" behindDoc="0" locked="0" layoutInCell="1" allowOverlap="1">
+            <wp:simplePos x="0" y="0"/>
+            <wp:positionH relativeFrom="page">
+              <wp:posOffset>534628</wp:posOffset>
+            </wp:positionH>
+            <wp:positionV relativeFrom="page">
+              <wp:posOffset>5110088</wp:posOffset>
+            </wp:positionV>
+            <wp:extent cx="644296" cy="105127"/>
+            <wp:effectExtent l="0" t="0" r="0" b="0"/>
+            <wp:wrapNone/>
+            <wp:docPr id="80" name="Region 80"/>
+            <wp:cNvGraphicFramePr/>
+            <a:graphic xmlns:a="http://schemas.openxmlformats.org/drawingml/2006/main">
+              <a:graphicData uri="http://schemas.microsoft.com/office/word/2010/wordprocessingShape">
+                <wps:wsp>
+                  <wps:cNvSpPr/>
+                  <wps:spPr>
+                    <a:xfrm rot="0"/>
+                    <a:prstGeom prst="rect">
+                      <a:avLst/>
+                    </a:prstGeom>
+                    <a:noFill/>
+                    <a:ln w="12700">
+                      <a:noFill/>
+                    </a:ln>
+                  </wps:spPr>
+                  <wps:txbx>
+                    <w:txbxContent>
+                      <w:p>
+                        <w:r>
+                          <w:rPr>
+                            <w:sz w:val="12"/>
+                          </w:rPr>
+                          <w:t>remarks:</w:t>
+                        </w:r>
+                      </w:p>
+                    </w:txbxContent>
+                  </wps:txbx>
+                  <wps:bodyPr lIns="0" tIns="0" rIns="0" bIns="0"/>
+                </wps:wsp>
+              </a:graphicData>
+            </a:graphic>
+          </wp:anchor>
+        </w:drawing>
+      </w:r>
+      <w:bookmarkEnd w:id="80"/>
+      <w:bookmarkStart w:id="81" w:name="p0002_r0044"/>
+      <w:r>
+        <w:drawing>
+          <wp:anchor distT="0" distB="0" distL="0" distR="0" simplePos="0" relativeHeight="81" behindDoc="0" locked="0" layoutInCell="1" allowOverlap="1">
+            <wp:simplePos x="0" y="0"/>
+            <wp:positionH relativeFrom="page">
+              <wp:posOffset>534628</wp:posOffset>
+            </wp:positionH>
+            <wp:positionV relativeFrom="page">
+              <wp:posOffset>5251781</wp:posOffset>
+            </wp:positionV>
+            <wp:extent cx="4249610" cy="9141"/>
+            <wp:effectExtent l="0" t="0" r="0" b="0"/>
+            <wp:wrapNone/>
+            <wp:docPr id="81" name="Region 81"/>
+            <wp:cNvGraphicFramePr/>
+            <a:graphic xmlns:a="http://schemas.openxmlformats.org/drawingml/2006/main">
+              <a:graphicData uri="http://schemas.microsoft.com/office/word/2010/wordprocessingShape">
+                <wps:wsp>
+                  <wps:cNvSpPr/>
+                  <wps:spPr>
+                    <a:xfrm rot="0"/>
+                    <a:prstGeom prst="rect">
+                      <a:avLst/>
+                    </a:prstGeom>
+                    <a:solidFill>
+                      <a:srgbClr val="000000"/>
+                    </a:solidFill>
+                    <a:ln w="12700">
+                      <a:noFill/>
+                    </a:ln>
+                  </wps:spPr>
+                </wps:wsp>
+              </a:graphicData>
+            </a:graphic>
+          </wp:anchor>
+        </w:drawing>
+      </w:r>
+      <w:bookmarkEnd w:id="81"/>
+      <w:bookmarkStart w:id="82" w:name="p0002_r0045"/>
+      <w:r>
+        <w:drawing>
+          <wp:anchor distT="0" distB="0" distL="0" distR="0" simplePos="0" relativeHeight="82" behindDoc="0" locked="0" layoutInCell="1" allowOverlap="1">
+            <wp:simplePos x="0" y="0"/>
+            <wp:positionH relativeFrom="page">
+              <wp:posOffset>534628</wp:posOffset>
+            </wp:positionH>
+            <wp:positionV relativeFrom="page">
+              <wp:posOffset>5558021</wp:posOffset>
+            </wp:positionV>
+            <wp:extent cx="4249610" cy="9141"/>
+            <wp:effectExtent l="0" t="0" r="0" b="0"/>
+            <wp:wrapNone/>
+            <wp:docPr id="82" name="Region 82"/>
+            <wp:cNvGraphicFramePr/>
+            <a:graphic xmlns:a="http://schemas.openxmlformats.org/drawingml/2006/main">
+              <a:graphicData uri="http://schemas.microsoft.com/office/word/2010/wordprocessingShape">
+                <wps:wsp>
+                  <wps:cNvSpPr/>
+                  <wps:spPr>
+                    <a:xfrm rot="0"/>
+                    <a:prstGeom prst="rect">
+                      <a:avLst/>
+                    </a:prstGeom>
+                    <a:solidFill>
+                      <a:srgbClr val="000000"/>
+                    </a:solidFill>
+                    <a:ln w="12700">
+                      <a:noFill/>
+                    </a:ln>
+                  </wps:spPr>
+                </wps:wsp>
+              </a:graphicData>
+            </a:graphic>
+          </wp:anchor>
+        </w:drawing>
+      </w:r>
+      <w:bookmarkEnd w:id="82"/>
+      <w:bookmarkStart w:id="83" w:name="p0002_r0046"/>
+      <w:r>
+        <w:drawing>
+          <wp:anchor distT="0" distB="0" distL="0" distR="0" simplePos="0" relativeHeight="83" behindDoc="0" locked="0" layoutInCell="1" allowOverlap="1">
+            <wp:simplePos x="0" y="0"/>
+            <wp:positionH relativeFrom="page">
+              <wp:posOffset>534628</wp:posOffset>
+            </wp:positionH>
+            <wp:positionV relativeFrom="page">
+              <wp:posOffset>5713426</wp:posOffset>
+            </wp:positionV>
+            <wp:extent cx="1050979" cy="109698"/>
+            <wp:effectExtent l="0" t="0" r="0" b="0"/>
+            <wp:wrapNone/>
+            <wp:docPr id="83" name="Region 83"/>
+            <wp:cNvGraphicFramePr/>
+            <a:graphic xmlns:a="http://schemas.openxmlformats.org/drawingml/2006/main">
+              <a:graphicData uri="http://schemas.microsoft.com/office/word/2010/wordprocessingShape">
+                <wps:wsp>
+                  <wps:cNvSpPr/>
+                  <wps:spPr>
+                    <a:xfrm rot="0"/>
+                    <a:prstGeom prst="rect">
+                      <a:avLst/>
+                    </a:prstGeom>
+                    <a:noFill/>
+                    <a:ln w="12700">
+                      <a:noFill/>
+                    </a:ln>
+                  </wps:spPr>
+                  <wps:txbx>
+                    <w:txbxContent>
+                      <w:p>
+                        <w:r>
+                          <w:rPr>
+                            <w:sz w:val="14"/>
+                          </w:rPr>
+                          <w:t>appointments</w:t>
+                        </w:r>
+                      </w:p>
+                    </w:txbxContent>
+                  </wps:txbx>
+                  <wps:bodyPr lIns="0" tIns="0" rIns="0" bIns="0"/>
+                </wps:wsp>
+              </a:graphicData>
+            </a:graphic>
+          </wp:anchor>
+        </w:drawing>
+      </w:r>
+      <w:bookmarkEnd w:id="83"/>
+      <w:bookmarkStart w:id="84" w:name="p0002_r0047"/>
+      <w:r>
+        <w:drawing>
+          <wp:anchor distT="0" distB="0" distL="0" distR="0" simplePos="0" relativeHeight="84" behindDoc="0" locked="0" layoutInCell="1" allowOverlap="1">
+            <wp:simplePos x="0" y="0"/>
+            <wp:positionH relativeFrom="page">
+              <wp:posOffset>534628</wp:posOffset>
+            </wp:positionH>
+            <wp:positionV relativeFrom="page">
+              <wp:posOffset>5859690</wp:posOffset>
+            </wp:positionV>
+            <wp:extent cx="4249610" cy="9141"/>
+            <wp:effectExtent l="0" t="0" r="0" b="0"/>
+            <wp:wrapNone/>
+            <wp:docPr id="84" name="Region 84"/>
+            <wp:cNvGraphicFramePr/>
+            <a:graphic xmlns:a="http://schemas.openxmlformats.org/drawingml/2006/main">
+              <a:graphicData uri="http://schemas.microsoft.com/office/word/2010/wordprocessingShape">
+                <wps:wsp>
+                  <wps:cNvSpPr/>
+                  <wps:spPr>
+                    <a:xfrm rot="0"/>
+                    <a:prstGeom prst="rect">
+                      <a:avLst/>
+                    </a:prstGeom>
+                    <a:solidFill>
+                      <a:srgbClr val="000000"/>
+                    </a:solidFill>
+                    <a:ln w="12700">
+                      <a:noFill/>
+                    </a:ln>
+                  </wps:spPr>
+                </wps:wsp>
+              </a:graphicData>
+            </a:graphic>
+          </wp:anchor>
+        </w:drawing>
+      </w:r>
+      <w:bookmarkEnd w:id="84"/>
+      <w:bookmarkStart w:id="85" w:name="p0002_r0048"/>
+      <w:r/>
       <w:bookmarkEnd w:id="85"/>
-      <w:bookmarkStart w:id="86" w:name="p0002_r0045"/>
+      <w:bookmarkStart w:id="86" w:name="p0002_r0049"/>
       <w:r>
         <w:drawing>
           <wp:anchor distT="0" distB="0" distL="0" distR="0" simplePos="0" relativeHeight="86" behindDoc="0" locked="0" layoutInCell="1" allowOverlap="1">
             <wp:simplePos x="0" y="0"/>
             <wp:positionH relativeFrom="page">
-              <wp:posOffset>534628</wp:posOffset>
+              <wp:posOffset>580323</wp:posOffset>
             </wp:positionH>
             <wp:positionV relativeFrom="page">
-              <wp:posOffset>4826702</wp:posOffset>
+              <wp:posOffset>6138505</wp:posOffset>
             </wp:positionV>
-            <wp:extent cx="1009854" cy="109698"/>
+            <wp:extent cx="1009854" cy="105127"/>
             <wp:effectExtent l="0" t="0" r="0" b="0"/>
             <wp:wrapNone/>
             <wp:docPr id="86" name="Region 86"/>
@@ -4116,9 +3869,9 @@
                       <w:p>
                         <w:r>
                           <w:rPr>
-                            <w:sz w:val="14"/>
+                            <w:sz w:val="12"/>
                           </w:rPr>
-                          <w:t>missing vaccinations:</w:t>
+                          <w:t>next vaccination:</w:t>
                         </w:r>
                       </w:p>
                     </w:txbxContent>
@@ -4131,62 +3884,21 @@
         </w:drawing>
       </w:r>
       <w:bookmarkEnd w:id="86"/>
-      <w:bookmarkStart w:id="87" w:name="p0002_r0046"/>
-      <w:r>
-        <w:drawing>
-          <wp:anchor xmlns:a="http://schemas.openxmlformats.org/drawingml/2006/main" xmlns:pic="http://schemas.openxmlformats.org/drawingml/2006/picture" distT="0" distB="0" distL="0" distR="0" simplePos="0" relativeHeight="87" behindDoc="0" locked="0" layoutInCell="1" allowOverlap="1">
-            <wp:simplePos x="0" y="0"/>
-            <wp:positionH relativeFrom="page">
-              <wp:posOffset>1599316</wp:posOffset>
-            </wp:positionH>
-            <wp:positionV relativeFrom="page">
-              <wp:posOffset>4771853</wp:posOffset>
-            </wp:positionV>
-            <wp:extent cx="3184922" cy="182829"/>
-            <wp:wrapNone/>
-            <wp:docPr id="87" name="Picture 87"/>
-            <wp:cNvGraphicFramePr>
-              <a:graphicFrameLocks noChangeAspect="1"/>
-            </wp:cNvGraphicFramePr>
-            <a:graphic>
-              <a:graphicData uri="http://schemas.openxmlformats.org/drawingml/2006/picture">
-                <pic:pic>
-                  <pic:nvPicPr>
-                    <pic:cNvPr id="0" name="image.png"/>
-                    <pic:cNvPicPr/>
-                  </pic:nvPicPr>
-                  <pic:blipFill>
-                    <a:blip r:embed="rId18"/>
-                    <a:stretch>
-                      <a:fillRect/>
-                    </a:stretch>
-                  </pic:blipFill>
-                  <pic:spPr>
-                    <a:xfrm>
-                      <a:off x="0" y="0"/>
-                      <a:ext cx="3184922" cy="182829"/>
-                    </a:xfrm>
-                    <a:prstGeom prst="rect"/>
-                  </pic:spPr>
-                </pic:pic>
-              </a:graphicData>
-            </a:graphic>
-          </wp:anchor>
-        </w:drawing>
-      </w:r>
+      <w:bookmarkStart w:id="87" w:name="p0002_r0050"/>
+      <w:r/>
       <w:bookmarkEnd w:id="87"/>
-      <w:bookmarkStart w:id="88" w:name="p0002_r0047"/>
+      <w:bookmarkStart w:id="88" w:name="p0002_r0051"/>
       <w:r>
         <w:drawing>
           <wp:anchor distT="0" distB="0" distL="0" distR="0" simplePos="0" relativeHeight="88" behindDoc="0" locked="0" layoutInCell="1" allowOverlap="1">
             <wp:simplePos x="0" y="0"/>
             <wp:positionH relativeFrom="page">
-              <wp:posOffset>534628</wp:posOffset>
+              <wp:posOffset>2782809</wp:posOffset>
             </wp:positionH>
             <wp:positionV relativeFrom="page">
-              <wp:posOffset>5105517</wp:posOffset>
+              <wp:posOffset>6138505</wp:posOffset>
             </wp:positionV>
-            <wp:extent cx="658004" cy="105127"/>
+            <wp:extent cx="301585" cy="105127"/>
             <wp:effectExtent l="0" t="0" r="0" b="0"/>
             <wp:wrapNone/>
             <wp:docPr id="88" name="Region 88"/>
@@ -4212,7 +3924,7 @@
                           <w:rPr>
                             <w:sz w:val="12"/>
                           </w:rPr>
-                          <w:t>Comments:</w:t>
+                          <w:t>U5 on:</w:t>
                         </w:r>
                       </w:p>
                     </w:txbxContent>
@@ -4225,7 +3937,7 @@
         </w:drawing>
       </w:r>
       <w:bookmarkEnd w:id="88"/>
-      <w:bookmarkStart w:id="89" w:name="p0002_r0048"/>
+      <w:bookmarkStart w:id="89" w:name="p0002_r0052"/>
       <w:r>
         <w:drawing>
           <wp:anchor distT="0" distB="0" distL="0" distR="0" simplePos="0" relativeHeight="89" behindDoc="0" locked="0" layoutInCell="1" allowOverlap="1">
@@ -4234,9 +3946,9 @@
               <wp:posOffset>534628</wp:posOffset>
             </wp:positionH>
             <wp:positionV relativeFrom="page">
-              <wp:posOffset>5251781</wp:posOffset>
+              <wp:posOffset>6403608</wp:posOffset>
             </wp:positionV>
-            <wp:extent cx="4254180" cy="9141"/>
+            <wp:extent cx="388405" cy="109698"/>
             <wp:effectExtent l="0" t="0" r="0" b="0"/>
             <wp:wrapNone/>
             <wp:docPr id="89" name="Region 89"/>
@@ -4250,13 +3962,24 @@
                     <a:prstGeom prst="rect">
                       <a:avLst/>
                     </a:prstGeom>
-                    <a:solidFill>
-                      <a:srgbClr val="000000"/>
-                    </a:solidFill>
+                    <a:noFill/>
                     <a:ln w="12700">
                       <a:noFill/>
                     </a:ln>
                   </wps:spPr>
+                  <wps:txbx>
+                    <w:txbxContent>
+                      <w:p>
+                        <w:r>
+                          <w:rPr>
+                            <w:sz w:val="14"/>
+                          </w:rPr>
+                          <w:t>stamp</w:t>
+                        </w:r>
+                      </w:p>
+                    </w:txbxContent>
+                  </wps:txbx>
+                  <wps:bodyPr lIns="0" tIns="0" rIns="0" bIns="0"/>
                 </wps:wsp>
               </a:graphicData>
             </a:graphic>
@@ -4264,7 +3987,7 @@
         </w:drawing>
       </w:r>
       <w:bookmarkEnd w:id="89"/>
-      <w:bookmarkStart w:id="90" w:name="p0002_r0049"/>
+      <w:bookmarkStart w:id="90" w:name="p0002_r0053"/>
       <w:r>
         <w:drawing>
           <wp:anchor distT="0" distB="0" distL="0" distR="0" simplePos="0" relativeHeight="90" behindDoc="0" locked="0" layoutInCell="1" allowOverlap="1">
@@ -4273,9 +3996,9 @@
               <wp:posOffset>534628</wp:posOffset>
             </wp:positionH>
             <wp:positionV relativeFrom="page">
-              <wp:posOffset>5558021</wp:posOffset>
+              <wp:posOffset>6549872</wp:posOffset>
             </wp:positionV>
-            <wp:extent cx="4254180" cy="9141"/>
+            <wp:extent cx="2033416" cy="9141"/>
             <wp:effectExtent l="0" t="0" r="0" b="0"/>
             <wp:wrapNone/>
             <wp:docPr id="90" name="Region 90"/>
@@ -4303,18 +4026,18 @@
         </w:drawing>
       </w:r>
       <w:bookmarkEnd w:id="90"/>
-      <w:bookmarkStart w:id="91" w:name="p0002_r0050"/>
+      <w:bookmarkStart w:id="91" w:name="p0002_r0054"/>
       <w:r>
         <w:drawing>
           <wp:anchor distT="0" distB="0" distL="0" distR="0" simplePos="0" relativeHeight="91" behindDoc="0" locked="0" layoutInCell="1" allowOverlap="1">
             <wp:simplePos x="0" y="0"/>
             <wp:positionH relativeFrom="page">
-              <wp:posOffset>534628</wp:posOffset>
+              <wp:posOffset>2732545</wp:posOffset>
             </wp:positionH>
             <wp:positionV relativeFrom="page">
-              <wp:posOffset>5713426</wp:posOffset>
+              <wp:posOffset>6403608</wp:posOffset>
             </wp:positionV>
-            <wp:extent cx="1032701" cy="114269"/>
+            <wp:extent cx="1224619" cy="109698"/>
             <wp:effectExtent l="0" t="0" r="0" b="0"/>
             <wp:wrapNone/>
             <wp:docPr id="91" name="Region 91"/>
@@ -4340,7 +4063,7 @@
                           <w:rPr>
                             <w:sz w:val="14"/>
                           </w:rPr>
-                          <w:t>Appointments</w:t>
+                          <w:t>signature and date:</w:t>
                         </w:r>
                       </w:p>
                     </w:txbxContent>
@@ -4353,18 +4076,18 @@
         </w:drawing>
       </w:r>
       <w:bookmarkEnd w:id="91"/>
-      <w:bookmarkStart w:id="92" w:name="p0002_r0051"/>
+      <w:bookmarkStart w:id="92" w:name="p0002_r0055"/>
       <w:r>
         <w:drawing>
           <wp:anchor distT="0" distB="0" distL="0" distR="0" simplePos="0" relativeHeight="92" behindDoc="0" locked="0" layoutInCell="1" allowOverlap="1">
             <wp:simplePos x="0" y="0"/>
             <wp:positionH relativeFrom="page">
-              <wp:posOffset>534628</wp:posOffset>
+              <wp:posOffset>2732545</wp:posOffset>
             </wp:positionH>
             <wp:positionV relativeFrom="page">
-              <wp:posOffset>5859690</wp:posOffset>
+              <wp:posOffset>6549872</wp:posOffset>
             </wp:positionV>
-            <wp:extent cx="4254180" cy="9141"/>
+            <wp:extent cx="2033416" cy="9141"/>
             <wp:effectExtent l="0" t="0" r="0" b="0"/>
             <wp:wrapNone/>
             <wp:docPr id="92" name="Region 92"/>
@@ -4392,259 +4115,21 @@
         </w:drawing>
       </w:r>
       <w:bookmarkEnd w:id="92"/>
-      <w:bookmarkStart w:id="93" w:name="p0002_r0052"/>
+      <w:bookmarkStart w:id="93" w:name="p0002_r0056"/>
       <w:r>
         <w:drawing>
-          <wp:anchor xmlns:a="http://schemas.openxmlformats.org/drawingml/2006/main" xmlns:pic="http://schemas.openxmlformats.org/drawingml/2006/picture" distT="0" distB="0" distL="0" distR="0" simplePos="0" relativeHeight="93" behindDoc="0" locked="0" layoutInCell="1" allowOverlap="1">
+          <wp:anchor distT="0" distB="0" distL="0" distR="0" simplePos="0" relativeHeight="93" behindDoc="0" locked="0" layoutInCell="1" allowOverlap="1">
             <wp:simplePos x="0" y="0"/>
             <wp:positionH relativeFrom="page">
               <wp:posOffset>534628</wp:posOffset>
             </wp:positionH>
             <wp:positionV relativeFrom="page">
-              <wp:posOffset>5919109</wp:posOffset>
+              <wp:posOffset>7153209</wp:posOffset>
             </wp:positionV>
-            <wp:extent cx="2056262" cy="338234"/>
-            <wp:wrapNone/>
-            <wp:docPr id="93" name="Picture 93"/>
-            <wp:cNvGraphicFramePr>
-              <a:graphicFrameLocks noChangeAspect="1"/>
-            </wp:cNvGraphicFramePr>
-            <a:graphic>
-              <a:graphicData uri="http://schemas.openxmlformats.org/drawingml/2006/picture">
-                <pic:pic>
-                  <pic:nvPicPr>
-                    <pic:cNvPr id="0" name="image.png"/>
-                    <pic:cNvPicPr/>
-                  </pic:nvPicPr>
-                  <pic:blipFill>
-                    <a:blip r:embed="rId19"/>
-                    <a:stretch>
-                      <a:fillRect/>
-                    </a:stretch>
-                  </pic:blipFill>
-                  <pic:spPr>
-                    <a:xfrm>
-                      <a:off x="0" y="0"/>
-                      <a:ext cx="2056262" cy="338234"/>
-                    </a:xfrm>
-                    <a:prstGeom prst="rect"/>
-                  </pic:spPr>
-                </pic:pic>
-              </a:graphicData>
-            </a:graphic>
-          </wp:anchor>
-        </w:drawing>
-      </w:r>
-      <w:bookmarkEnd w:id="93"/>
-      <w:bookmarkStart w:id="94" w:name="p0002_r0053"/>
-      <w:r>
-        <w:drawing>
-          <wp:anchor distT="0" distB="0" distL="0" distR="0" simplePos="0" relativeHeight="94" behindDoc="0" locked="0" layoutInCell="1" allowOverlap="1">
-            <wp:simplePos x="0" y="0"/>
-            <wp:positionH relativeFrom="page">
-              <wp:posOffset>580323</wp:posOffset>
-            </wp:positionH>
-            <wp:positionV relativeFrom="page">
-              <wp:posOffset>6133934</wp:posOffset>
-            </wp:positionV>
-            <wp:extent cx="1165216" cy="105127"/>
+            <wp:extent cx="2033416" cy="9141"/>
             <wp:effectExtent l="0" t="0" r="0" b="0"/>
             <wp:wrapNone/>
-            <wp:docPr id="94" name="Region 94"/>
-            <wp:cNvGraphicFramePr/>
-            <a:graphic xmlns:a="http://schemas.openxmlformats.org/drawingml/2006/main">
-              <a:graphicData uri="http://schemas.microsoft.com/office/word/2010/wordprocessingShape">
-                <wps:wsp>
-                  <wps:cNvSpPr/>
-                  <wps:spPr>
-                    <a:xfrm rot="0"/>
-                    <a:prstGeom prst="rect">
-                      <a:avLst/>
-                    </a:prstGeom>
-                    <a:noFill/>
-                    <a:ln w="12700">
-                      <a:noFill/>
-                    </a:ln>
-                  </wps:spPr>
-                  <wps:txbx>
-                    <w:txbxContent>
-                      <w:p>
-                        <w:r>
-                          <w:rPr>
-                            <w:sz w:val="10"/>
-                          </w:rPr>
-                          <w:t>next vaccination appointment on:</w:t>
-                        </w:r>
-                      </w:p>
-                    </w:txbxContent>
-                  </wps:txbx>
-                  <wps:bodyPr lIns="0" tIns="0" rIns="0" bIns="0"/>
-                </wps:wsp>
-              </a:graphicData>
-            </a:graphic>
-          </wp:anchor>
-        </w:drawing>
-      </w:r>
-      <w:bookmarkEnd w:id="94"/>
-      <w:bookmarkStart w:id="95" w:name="p0002_r0054"/>
-      <w:r>
-        <w:drawing>
-          <wp:anchor xmlns:a="http://schemas.openxmlformats.org/drawingml/2006/main" xmlns:pic="http://schemas.openxmlformats.org/drawingml/2006/picture" distT="0" distB="0" distL="0" distR="0" simplePos="0" relativeHeight="95" behindDoc="0" locked="0" layoutInCell="1" allowOverlap="1">
-            <wp:simplePos x="0" y="0"/>
-            <wp:positionH relativeFrom="page">
-              <wp:posOffset>2732545</wp:posOffset>
-            </wp:positionH>
-            <wp:positionV relativeFrom="page">
-              <wp:posOffset>5919109</wp:posOffset>
-            </wp:positionV>
-            <wp:extent cx="2051693" cy="338234"/>
-            <wp:wrapNone/>
-            <wp:docPr id="95" name="Picture 95"/>
-            <wp:cNvGraphicFramePr>
-              <a:graphicFrameLocks noChangeAspect="1"/>
-            </wp:cNvGraphicFramePr>
-            <a:graphic>
-              <a:graphicData uri="http://schemas.openxmlformats.org/drawingml/2006/picture">
-                <pic:pic>
-                  <pic:nvPicPr>
-                    <pic:cNvPr id="0" name="image.png"/>
-                    <pic:cNvPicPr/>
-                  </pic:nvPicPr>
-                  <pic:blipFill>
-                    <a:blip r:embed="rId20"/>
-                    <a:stretch>
-                      <a:fillRect/>
-                    </a:stretch>
-                  </pic:blipFill>
-                  <pic:spPr>
-                    <a:xfrm>
-                      <a:off x="0" y="0"/>
-                      <a:ext cx="2051693" cy="338234"/>
-                    </a:xfrm>
-                    <a:prstGeom prst="rect"/>
-                  </pic:spPr>
-                </pic:pic>
-              </a:graphicData>
-            </a:graphic>
-          </wp:anchor>
-        </w:drawing>
-      </w:r>
-      <w:bookmarkEnd w:id="95"/>
-      <w:bookmarkStart w:id="96" w:name="p0002_r0055"/>
-      <w:r>
-        <w:drawing>
-          <wp:anchor distT="0" distB="0" distL="0" distR="0" simplePos="0" relativeHeight="96" behindDoc="0" locked="0" layoutInCell="1" allowOverlap="1">
-            <wp:simplePos x="0" y="0"/>
-            <wp:positionH relativeFrom="page">
-              <wp:posOffset>2782809</wp:posOffset>
-            </wp:positionH>
-            <wp:positionV relativeFrom="page">
-              <wp:posOffset>6133934</wp:posOffset>
-            </wp:positionV>
-            <wp:extent cx="397544" cy="105127"/>
-            <wp:effectExtent l="0" t="0" r="0" b="0"/>
-            <wp:wrapNone/>
-            <wp:docPr id="96" name="Region 96"/>
-            <wp:cNvGraphicFramePr/>
-            <a:graphic xmlns:a="http://schemas.openxmlformats.org/drawingml/2006/main">
-              <a:graphicData uri="http://schemas.microsoft.com/office/word/2010/wordprocessingShape">
-                <wps:wsp>
-                  <wps:cNvSpPr/>
-                  <wps:spPr>
-                    <a:xfrm rot="0"/>
-                    <a:prstGeom prst="rect">
-                      <a:avLst/>
-                    </a:prstGeom>
-                    <a:noFill/>
-                    <a:ln w="12700">
-                      <a:noFill/>
-                    </a:ln>
-                  </wps:spPr>
-                  <wps:txbx>
-                    <w:txbxContent>
-                      <w:p>
-                        <w:r>
-                          <w:rPr>
-                            <w:sz w:val="12"/>
-                          </w:rPr>
-                          <w:t>U5 am:</w:t>
-                        </w:r>
-                      </w:p>
-                    </w:txbxContent>
-                  </wps:txbx>
-                  <wps:bodyPr lIns="0" tIns="0" rIns="0" bIns="0"/>
-                </wps:wsp>
-              </a:graphicData>
-            </a:graphic>
-          </wp:anchor>
-        </w:drawing>
-      </w:r>
-      <w:bookmarkEnd w:id="96"/>
-      <w:bookmarkStart w:id="97" w:name="p0002_r0056"/>
-      <w:r>
-        <w:drawing>
-          <wp:anchor distT="0" distB="0" distL="0" distR="0" simplePos="0" relativeHeight="97" behindDoc="0" locked="0" layoutInCell="1" allowOverlap="1">
-            <wp:simplePos x="0" y="0"/>
-            <wp:positionH relativeFrom="page">
-              <wp:posOffset>534628</wp:posOffset>
-            </wp:positionH>
-            <wp:positionV relativeFrom="page">
-              <wp:posOffset>6403608</wp:posOffset>
-            </wp:positionV>
-            <wp:extent cx="406683" cy="114269"/>
-            <wp:effectExtent l="0" t="0" r="0" b="0"/>
-            <wp:wrapNone/>
-            <wp:docPr id="97" name="Region 97"/>
-            <wp:cNvGraphicFramePr/>
-            <a:graphic xmlns:a="http://schemas.openxmlformats.org/drawingml/2006/main">
-              <a:graphicData uri="http://schemas.microsoft.com/office/word/2010/wordprocessingShape">
-                <wps:wsp>
-                  <wps:cNvSpPr/>
-                  <wps:spPr>
-                    <a:xfrm rot="0"/>
-                    <a:prstGeom prst="rect">
-                      <a:avLst/>
-                    </a:prstGeom>
-                    <a:noFill/>
-                    <a:ln w="12700">
-                      <a:noFill/>
-                    </a:ln>
-                  </wps:spPr>
-                  <wps:txbx>
-                    <w:txbxContent>
-                      <w:p>
-                        <w:r>
-                          <w:rPr>
-                            <w:sz w:val="14"/>
-                          </w:rPr>
-                          <w:t>Stamp</w:t>
-                        </w:r>
-                      </w:p>
-                    </w:txbxContent>
-                  </wps:txbx>
-                  <wps:bodyPr lIns="0" tIns="0" rIns="0" bIns="0"/>
-                </wps:wsp>
-              </a:graphicData>
-            </a:graphic>
-          </wp:anchor>
-        </w:drawing>
-      </w:r>
-      <w:bookmarkEnd w:id="97"/>
-      <w:bookmarkStart w:id="98" w:name="p0002_r0057"/>
-      <w:r>
-        <w:drawing>
-          <wp:anchor distT="0" distB="0" distL="0" distR="0" simplePos="0" relativeHeight="98" behindDoc="0" locked="0" layoutInCell="1" allowOverlap="1">
-            <wp:simplePos x="0" y="0"/>
-            <wp:positionH relativeFrom="page">
-              <wp:posOffset>534628</wp:posOffset>
-            </wp:positionH>
-            <wp:positionV relativeFrom="page">
-              <wp:posOffset>6549872</wp:posOffset>
-            </wp:positionV>
-            <wp:extent cx="2037985" cy="9141"/>
-            <wp:effectExtent l="0" t="0" r="0" b="0"/>
-            <wp:wrapNone/>
-            <wp:docPr id="98" name="Region 98"/>
+            <wp:docPr id="93" name="Region 93"/>
             <wp:cNvGraphicFramePr/>
             <a:graphic xmlns:a="http://schemas.openxmlformats.org/drawingml/2006/main">
               <a:graphicData uri="http://schemas.microsoft.com/office/word/2010/wordprocessingShape">
@@ -4668,72 +4153,22 @@
           </wp:anchor>
         </w:drawing>
       </w:r>
-      <w:bookmarkEnd w:id="98"/>
-      <w:bookmarkStart w:id="99" w:name="p0002_r0058"/>
+      <w:bookmarkEnd w:id="93"/>
+      <w:bookmarkStart w:id="94" w:name="p0002_r0057"/>
       <w:r>
         <w:drawing>
-          <wp:anchor distT="0" distB="0" distL="0" distR="0" simplePos="0" relativeHeight="99" behindDoc="0" locked="0" layoutInCell="1" allowOverlap="1">
+          <wp:anchor distT="0" distB="0" distL="0" distR="0" simplePos="0" relativeHeight="94" behindDoc="0" locked="0" layoutInCell="1" allowOverlap="1">
             <wp:simplePos x="0" y="0"/>
             <wp:positionH relativeFrom="page">
               <wp:posOffset>2732545</wp:posOffset>
             </wp:positionH>
             <wp:positionV relativeFrom="page">
-              <wp:posOffset>6403608</wp:posOffset>
-            </wp:positionV>
-            <wp:extent cx="1092104" cy="114269"/>
-            <wp:effectExtent l="0" t="0" r="0" b="0"/>
-            <wp:wrapNone/>
-            <wp:docPr id="99" name="Region 99"/>
-            <wp:cNvGraphicFramePr/>
-            <a:graphic xmlns:a="http://schemas.openxmlformats.org/drawingml/2006/main">
-              <a:graphicData uri="http://schemas.microsoft.com/office/word/2010/wordprocessingShape">
-                <wps:wsp>
-                  <wps:cNvSpPr/>
-                  <wps:spPr>
-                    <a:xfrm rot="0"/>
-                    <a:prstGeom prst="rect">
-                      <a:avLst/>
-                    </a:prstGeom>
-                    <a:noFill/>
-                    <a:ln w="12700">
-                      <a:noFill/>
-                    </a:ln>
-                  </wps:spPr>
-                  <wps:txbx>
-                    <w:txbxContent>
-                      <w:p>
-                        <w:r>
-                          <w:rPr>
-                            <w:sz w:val="14"/>
-                          </w:rPr>
-                          <w:t>Signature and date:</w:t>
-                        </w:r>
-                      </w:p>
-                    </w:txbxContent>
-                  </wps:txbx>
-                  <wps:bodyPr lIns="0" tIns="0" rIns="0" bIns="0"/>
-                </wps:wsp>
-              </a:graphicData>
-            </a:graphic>
-          </wp:anchor>
-        </w:drawing>
-      </w:r>
-      <w:bookmarkEnd w:id="99"/>
-      <w:bookmarkStart w:id="100" w:name="p0002_r0059"/>
-      <w:r>
-        <w:drawing>
-          <wp:anchor distT="0" distB="0" distL="0" distR="0" simplePos="0" relativeHeight="100" behindDoc="0" locked="0" layoutInCell="1" allowOverlap="1">
-            <wp:simplePos x="0" y="0"/>
-            <wp:positionH relativeFrom="page">
-              <wp:posOffset>2732545</wp:posOffset>
-            </wp:positionH>
-            <wp:positionV relativeFrom="page">
-              <wp:posOffset>6549872</wp:posOffset>
+              <wp:posOffset>7153209</wp:posOffset>
             </wp:positionV>
             <wp:extent cx="2033416" cy="9141"/>
             <wp:effectExtent l="0" t="0" r="0" b="0"/>
             <wp:wrapNone/>
-            <wp:docPr id="100" name="Region 100"/>
+            <wp:docPr id="94" name="Region 94"/>
             <wp:cNvGraphicFramePr/>
             <a:graphic xmlns:a="http://schemas.openxmlformats.org/drawingml/2006/main">
               <a:graphicData uri="http://schemas.microsoft.com/office/word/2010/wordprocessingShape">
@@ -4757,100 +4192,22 @@
           </wp:anchor>
         </w:drawing>
       </w:r>
-      <w:bookmarkEnd w:id="100"/>
-      <w:bookmarkStart w:id="101" w:name="p0002_r0060"/>
+      <w:bookmarkEnd w:id="94"/>
+      <w:bookmarkStart w:id="95" w:name="p0002_r0058"/>
       <w:r>
         <w:drawing>
-          <wp:anchor distT="0" distB="0" distL="0" distR="0" simplePos="0" relativeHeight="101" behindDoc="0" locked="0" layoutInCell="1" allowOverlap="1">
+          <wp:anchor distT="0" distB="0" distL="0" distR="0" simplePos="0" relativeHeight="95" behindDoc="0" locked="0" layoutInCell="1" allowOverlap="1">
             <wp:simplePos x="0" y="0"/>
             <wp:positionH relativeFrom="page">
-              <wp:posOffset>534628</wp:posOffset>
-            </wp:positionH>
-            <wp:positionV relativeFrom="page">
-              <wp:posOffset>7153209</wp:posOffset>
-            </wp:positionV>
-            <wp:extent cx="2037985" cy="9141"/>
-            <wp:effectExtent l="0" t="0" r="0" b="0"/>
-            <wp:wrapNone/>
-            <wp:docPr id="101" name="Region 101"/>
-            <wp:cNvGraphicFramePr/>
-            <a:graphic xmlns:a="http://schemas.openxmlformats.org/drawingml/2006/main">
-              <a:graphicData uri="http://schemas.microsoft.com/office/word/2010/wordprocessingShape">
-                <wps:wsp>
-                  <wps:cNvSpPr/>
-                  <wps:spPr>
-                    <a:xfrm rot="0"/>
-                    <a:prstGeom prst="rect">
-                      <a:avLst/>
-                    </a:prstGeom>
-                    <a:solidFill>
-                      <a:srgbClr val="000000"/>
-                    </a:solidFill>
-                    <a:ln w="12700">
-                      <a:noFill/>
-                    </a:ln>
-                  </wps:spPr>
-                </wps:wsp>
-              </a:graphicData>
-            </a:graphic>
-          </wp:anchor>
-        </w:drawing>
-      </w:r>
-      <w:bookmarkEnd w:id="101"/>
-      <w:bookmarkStart w:id="102" w:name="p0002_r0061"/>
-      <w:r>
-        <w:drawing>
-          <wp:anchor distT="0" distB="0" distL="0" distR="0" simplePos="0" relativeHeight="102" behindDoc="0" locked="0" layoutInCell="1" allowOverlap="1">
-            <wp:simplePos x="0" y="0"/>
-            <wp:positionH relativeFrom="page">
-              <wp:posOffset>2732545</wp:posOffset>
-            </wp:positionH>
-            <wp:positionV relativeFrom="page">
-              <wp:posOffset>7153209</wp:posOffset>
-            </wp:positionV>
-            <wp:extent cx="2033416" cy="9141"/>
-            <wp:effectExtent l="0" t="0" r="0" b="0"/>
-            <wp:wrapNone/>
-            <wp:docPr id="102" name="Region 102"/>
-            <wp:cNvGraphicFramePr/>
-            <a:graphic xmlns:a="http://schemas.openxmlformats.org/drawingml/2006/main">
-              <a:graphicData uri="http://schemas.microsoft.com/office/word/2010/wordprocessingShape">
-                <wps:wsp>
-                  <wps:cNvSpPr/>
-                  <wps:spPr>
-                    <a:xfrm rot="0"/>
-                    <a:prstGeom prst="rect">
-                      <a:avLst/>
-                    </a:prstGeom>
-                    <a:solidFill>
-                      <a:srgbClr val="000000"/>
-                    </a:solidFill>
-                    <a:ln w="12700">
-                      <a:noFill/>
-                    </a:ln>
-                  </wps:spPr>
-                </wps:wsp>
-              </a:graphicData>
-            </a:graphic>
-          </wp:anchor>
-        </w:drawing>
-      </w:r>
-      <w:bookmarkEnd w:id="102"/>
-      <w:bookmarkStart w:id="103" w:name="p0002_r0062"/>
-      <w:r>
-        <w:drawing>
-          <wp:anchor distT="0" distB="0" distL="0" distR="0" simplePos="0" relativeHeight="103" behindDoc="0" locked="0" layoutInCell="1" allowOverlap="1">
-            <wp:simplePos x="0" y="0"/>
-            <wp:positionH relativeFrom="page">
-              <wp:posOffset>210196</wp:posOffset>
+              <wp:posOffset>214765</wp:posOffset>
             </wp:positionH>
             <wp:positionV relativeFrom="page">
               <wp:posOffset>7258336</wp:posOffset>
             </wp:positionV>
-            <wp:extent cx="123376" cy="91415"/>
+            <wp:extent cx="109667" cy="95986"/>
             <wp:effectExtent l="0" t="0" r="0" b="0"/>
             <wp:wrapNone/>
-            <wp:docPr id="103" name="Region 103"/>
+            <wp:docPr id="95" name="Region 95"/>
             <wp:cNvGraphicFramePr/>
             <a:graphic xmlns:a="http://schemas.openxmlformats.org/drawingml/2006/main">
               <a:graphicData uri="http://schemas.microsoft.com/office/word/2010/wordprocessingShape">
@@ -4871,7 +4228,7 @@
                       <w:p>
                         <w:r>
                           <w:rPr>
-                            <w:sz w:val="10"/>
+                            <w:sz w:val="12"/>
                           </w:rPr>
                           <w:t>28</w:t>
                         </w:r>
@@ -4885,7 +4242,7 @@
           </wp:anchor>
         </w:drawing>
       </w:r>
-      <w:bookmarkEnd w:id="103"/>
+      <w:bookmarkEnd w:id="95"/>
     </w:p>
     <w:sectPr>
       <w:pgSz w:w="8391" w:h="11906"/>

</xml_diff>